<commit_message>
Align TTN word template with Excel front page
</commit_message>
<xml_diff>
--- a/assets/Шаблон_ТТН_демо.docx
+++ b/assets/Шаблон_ТТН_демо.docx
@@ -2,125 +2,23 @@
 <file path=word/document.xml><?xml version="1.0" encoding="utf-8"?>
 <w:document xmlns:wpc="http://schemas.microsoft.com/office/word/2010/wordprocessingCanvas" xmlns:cx="http://schemas.microsoft.com/office/drawing/2014/chartex" xmlns:mc="http://schemas.openxmlformats.org/markup-compatibility/2006" xmlns:o="urn:schemas-microsoft-com:office:office" xmlns:r="http://schemas.openxmlformats.org/officeDocument/2006/relationships" xmlns:m="http://schemas.openxmlformats.org/officeDocument/2006/math" xmlns:v="urn:schemas-microsoft-com:vml" xmlns:wp14="http://schemas.microsoft.com/office/word/2010/wordprocessingDrawing" xmlns:wp="http://schemas.openxmlformats.org/drawingml/2006/wordprocessingDrawing" xmlns:w10="urn:schemas-microsoft-com:office:word" xmlns:w="http://schemas.openxmlformats.org/wordprocessingml/2006/main" xmlns:w14="http://schemas.microsoft.com/office/word/2010/wordml" xmlns:w15="http://schemas.microsoft.com/office/word/2012/wordml" xmlns:w16se="http://schemas.microsoft.com/office/word/2015/wordml/symex" xmlns:wpg="http://schemas.microsoft.com/office/word/2010/wordprocessingGroup" xmlns:wpi="http://schemas.microsoft.com/office/word/2010/wordprocessingInk" xmlns:wne="http://schemas.microsoft.com/office/word/2006/wordml" xmlns:wps="http://schemas.microsoft.com/office/word/2010/wordprocessingShape" mc:Ignorable="w14 w15 w16se wp14">
   <w:body>
-    <w:tbl>
-      <w:tblPr>
-        <w:tblStyle w:val="a5"/>
-        <w:tblW w:w="0" w:type="auto"/>
-        <w:tblInd w:w="4219" w:type="dxa"/>
-        <w:tblBorders>
-          <w:top w:val="none" w:sz="0" w:space="0" w:color="auto"/>
-          <w:left w:val="none" w:sz="0" w:space="0" w:color="auto"/>
-          <w:bottom w:val="none" w:sz="0" w:space="0" w:color="auto"/>
-          <w:right w:val="none" w:sz="0" w:space="0" w:color="auto"/>
-          <w:insideH w:val="none" w:sz="0" w:space="0" w:color="auto"/>
-          <w:insideV w:val="none" w:sz="0" w:space="0" w:color="auto"/>
-        </w:tblBorders>
-        <w:tblLook w:val="04A0" w:firstRow="1" w:lastRow="0" w:firstColumn="1" w:lastColumn="0" w:noHBand="0" w:noVBand="1"/>
-      </w:tblPr>
-      <w:tblGrid>
-        <w:gridCol w:w="2381"/>
-        <w:gridCol w:w="2381"/>
-        <w:gridCol w:w="2381"/>
-      </w:tblGrid>
-      <w:tr>
-        <w:trPr>
-          <w:trHeight w:hRule="exact" w:val="340"/>
-        </w:trPr>
-        <w:tc>
-          <w:tcPr>
-            <w:tcW w:w="2381" w:type="dxa"/>
-          </w:tcPr>
-          <w:p>
-            <w:pPr>
-              <w:spacing w:after="0" w:line="240" w:lineRule="auto"/>
-              <w:jc w:val="center"/>
-              <w:rPr>
-                <w:rFonts w:ascii="Times New Roman" w:hAnsi="Times New Roman" w:cs="Times New Roman"/>
-                <w:szCs w:val="24"/>
-                <w:lang w:val="en-US"/>
-              </w:rPr>
-            </w:pPr>
-            <w:r>
-              <w:rPr>
-                <w:rFonts w:ascii="Times New Roman" w:hAnsi="Times New Roman" w:cs="Times New Roman"/>
-                <w:szCs w:val="24"/>
-                <w:lang w:val="en-US"/>
-              </w:rPr>
-              <w:t>{{shipper_unp}}</w:t>
-            </w:r>
-          </w:p>
-        </w:tc>
-        <w:tc>
-          <w:tcPr>
-            <w:tcW w:w="2381" w:type="dxa"/>
-          </w:tcPr>
-          <w:p>
-            <w:pPr>
-              <w:spacing w:after="0" w:line="240" w:lineRule="auto"/>
-              <w:jc w:val="center"/>
-              <w:rPr>
-                <w:rFonts w:ascii="Times New Roman" w:hAnsi="Times New Roman" w:cs="Times New Roman"/>
-                <w:szCs w:val="24"/>
-                <w:lang w:val="en-US"/>
-              </w:rPr>
-            </w:pPr>
-            <w:r>
-              <w:rPr>
-                <w:rFonts w:ascii="Times New Roman" w:hAnsi="Times New Roman" w:cs="Times New Roman"/>
-                <w:szCs w:val="24"/>
-                <w:lang w:val="en-US"/>
-              </w:rPr>
-              <w:t>{{consignee_unp}}</w:t>
-            </w:r>
-          </w:p>
-        </w:tc>
-        <w:tc>
-          <w:tcPr>
-            <w:tcW w:w="2381" w:type="dxa"/>
-          </w:tcPr>
-          <w:p>
-            <w:pPr>
-              <w:spacing w:after="0" w:line="240" w:lineRule="auto"/>
-              <w:jc w:val="center"/>
-              <w:rPr>
-                <w:rFonts w:ascii="Times New Roman" w:hAnsi="Times New Roman" w:cs="Times New Roman"/>
-                <w:szCs w:val="24"/>
-              </w:rPr>
-            </w:pPr>
-            <w:r>
-              <w:rPr>
-                <w:rFonts w:ascii="Times New Roman" w:hAnsi="Times New Roman" w:cs="Times New Roman"/>
-                <w:szCs w:val="24"/>
-                <w:lang w:val="en-US"/>
-              </w:rPr>
-              <w:t>{{customer_unp}}</w:t>
-            </w:r>
-          </w:p>
-        </w:tc>
-      </w:tr>
-    </w:tbl>
     <w:p>
       <w:pPr>
-        <w:spacing w:before="240"/>
-        <w:rPr>
-          <w:rFonts w:ascii="Times New Roman" w:hAnsi="Times New Roman" w:cs="Times New Roman"/>
-          <w:szCs w:val="24"/>
-          <w:lang w:val="en-US"/>
-        </w:rPr>
+        <w:spacing w:before="0" w:after="0" w:line="643" w:lineRule="exact"/>
       </w:pPr>
       <w:r>
         <w:rPr>
-          <w:rFonts w:ascii="Times New Roman" w:hAnsi="Times New Roman" w:cs="Times New Roman"/>
-          <w:szCs w:val="24"/>
-          <w:lang w:val="en-US"/>
-        </w:rPr>
-        <w:tab/>
+          <w:rFonts w:ascii="Times New Roman" w:hAnsi="Times New Roman" w:cs="Times New Roman" w:eastAsia="Times New Roman"/>
+          <w:b w:val="0"/>
+          <w:sz w:val="2"/>
+        </w:rPr>
       </w:r>
     </w:p>
     <w:tbl>
       <w:tblPr>
         <w:tblStyle w:val="a5"/>
-        <w:tblW w:w="0" w:type="auto"/>
+        <w:tblW w:w="4242" w:type="dxa"/>
+        <w:tblInd w:w="5501" w:type="dxa"/>
         <w:tblBorders>
           <w:top w:val="none" w:sz="0" w:space="0" w:color="auto"/>
           <w:left w:val="none" w:sz="0" w:space="0" w:color="auto"/>
@@ -133,490 +31,91 @@
         <w:tblLook w:val="04A0" w:firstRow="1" w:lastRow="0" w:firstColumn="1" w:lastColumn="0" w:noHBand="0" w:noVBand="1"/>
       </w:tblPr>
       <w:tblGrid>
-        <w:gridCol w:w="4567"/>
-        <w:gridCol w:w="1458"/>
-        <w:gridCol w:w="1600"/>
-        <w:gridCol w:w="1423"/>
-        <w:gridCol w:w="1559"/>
-        <w:gridCol w:w="4521"/>
+        <w:gridCol w:w="1253"/>
+        <w:gridCol w:w="1255"/>
+        <w:gridCol w:w="1734"/>
       </w:tblGrid>
       <w:tr>
         <w:trPr>
-          <w:gridBefore w:val="1"/>
-          <w:gridAfter w:val="2"/>
-          <w:wBefore w:w="4567" w:type="dxa"/>
-          <w:wAfter w:w="6080" w:type="dxa"/>
-          <w:trHeight w:hRule="exact" w:val="397"/>
+          <w:trHeight w:val="307" w:hRule="exact"/>
         </w:trPr>
         <w:tc>
           <w:tcPr>
-            <w:tcW w:w="1458" w:type="dxa"/>
+            <w:tcW w:w="1253" w:type="dxa"/>
             <w:vAlign w:val="center"/>
           </w:tcPr>
           <w:p>
             <w:pPr>
-              <w:spacing w:after="0" w:line="240" w:lineRule="auto"/>
-              <w:ind w:firstLineChars="150" w:firstLine="360"/>
-              <w:jc w:val="both"/>
-              <w:rPr>
-                <w:rFonts w:ascii="Times New Roman" w:hAnsi="Times New Roman" w:cs="Times New Roman"/>
-                <w:sz w:val="24"/>
-                <w:szCs w:val="24"/>
-                <w:lang w:val="en-US"/>
-              </w:rPr>
-            </w:pPr>
-            <w:r>
-              <w:rPr>
-                <w:rFonts w:ascii="Times New Roman" w:hAnsi="Times New Roman" w:cs="Times New Roman"/>
-                <w:sz w:val="24"/>
-                <w:szCs w:val="24"/>
-                <w:lang w:val="en-US"/>
-              </w:rPr>
-              <w:t>{{day}}</w:t>
-            </w:r>
-          </w:p>
-        </w:tc>
-        <w:tc>
-          <w:tcPr>
-            <w:tcW w:w="1600" w:type="dxa"/>
+              <w:spacing w:after="0" w:line="240" w:lineRule="auto" w:before="0"/>
+              <w:jc w:val="center"/>
+              <w:rPr>
+                <w:rFonts w:ascii="Times New Roman" w:hAnsi="Times New Roman" w:cs="Times New Roman"/>
+                <w:szCs w:val="24"/>
+                <w:lang w:val="en-US"/>
+              </w:rPr>
+            </w:pPr>
+            <w:r>
+              <w:rPr>
+                <w:rFonts w:ascii="Times New Roman" w:hAnsi="Times New Roman" w:cs="Times New Roman" w:eastAsia="Times New Roman"/>
+                <w:b w:val="0"/>
+                <w:sz w:val="18"/>
+                <w:szCs w:val="24"/>
+                <w:lang w:val="en-US"/>
+              </w:rPr>
+              <w:t>{{shipper_unp}}</w:t>
+            </w:r>
+          </w:p>
+        </w:tc>
+        <w:tc>
+          <w:tcPr>
+            <w:tcW w:w="1255" w:type="dxa"/>
             <w:vAlign w:val="center"/>
           </w:tcPr>
           <w:p>
             <w:pPr>
-              <w:spacing w:after="0" w:line="240" w:lineRule="auto"/>
+              <w:spacing w:after="0" w:line="240" w:lineRule="auto" w:before="0"/>
               <w:jc w:val="center"/>
               <w:rPr>
                 <w:rFonts w:ascii="Times New Roman" w:hAnsi="Times New Roman" w:cs="Times New Roman"/>
-                <w:sz w:val="24"/>
-                <w:szCs w:val="24"/>
-                <w:lang w:val="en-US"/>
-              </w:rPr>
-            </w:pPr>
-            <w:r>
-              <w:rPr>
-                <w:rFonts w:ascii="Times New Roman" w:hAnsi="Times New Roman" w:cs="Times New Roman"/>
-                <w:sz w:val="24"/>
-                <w:szCs w:val="24"/>
-                <w:lang w:val="en-US"/>
-              </w:rPr>
-              <w:t>{{month}}</w:t>
-            </w:r>
-          </w:p>
-        </w:tc>
-        <w:tc>
-          <w:tcPr>
-            <w:tcW w:w="1423" w:type="dxa"/>
+                <w:szCs w:val="24"/>
+                <w:lang w:val="en-US"/>
+              </w:rPr>
+            </w:pPr>
+            <w:r>
+              <w:rPr>
+                <w:rFonts w:ascii="Times New Roman" w:hAnsi="Times New Roman" w:cs="Times New Roman" w:eastAsia="Times New Roman"/>
+                <w:b w:val="0"/>
+                <w:sz w:val="18"/>
+                <w:szCs w:val="24"/>
+                <w:lang w:val="en-US"/>
+              </w:rPr>
+              <w:t>{{consignee_unp}}</w:t>
+            </w:r>
+          </w:p>
+        </w:tc>
+        <w:tc>
+          <w:tcPr>
+            <w:tcW w:w="1734" w:type="dxa"/>
             <w:vAlign w:val="center"/>
           </w:tcPr>
           <w:p>
             <w:pPr>
-              <w:spacing w:after="0" w:line="240" w:lineRule="auto"/>
-              <w:jc w:val="both"/>
-              <w:rPr>
-                <w:rFonts w:ascii="Times New Roman" w:hAnsi="Times New Roman" w:cs="Times New Roman"/>
-                <w:sz w:val="24"/>
-                <w:szCs w:val="24"/>
-                <w:lang w:val="en-US"/>
-              </w:rPr>
-            </w:pPr>
-            <w:r>
-              <w:rPr>
-                <w:rFonts w:ascii="Times New Roman" w:hAnsi="Times New Roman" w:cs="Times New Roman"/>
-                <w:sz w:val="24"/>
-                <w:szCs w:val="24"/>
-                <w:lang w:val="en-US"/>
-              </w:rPr>
-              <w:t xml:space="preserve"> </w:t>
-            </w:r>
-            <w:r>
-              <w:rPr>
-                <w:rFonts w:ascii="Times New Roman" w:hAnsi="Times New Roman" w:cs="Times New Roman"/>
-                <w:sz w:val="24"/>
-                <w:szCs w:val="24"/>
-              </w:rPr>
-              <w:t xml:space="preserve">   </w:t>
-            </w:r>
-            <w:r>
-              <w:rPr>
-                <w:rFonts w:ascii="Times New Roman" w:hAnsi="Times New Roman" w:cs="Times New Roman"/>
-                <w:sz w:val="24"/>
-                <w:szCs w:val="24"/>
-                <w:lang w:val="en-US"/>
-              </w:rPr>
-              <w:t>{{year}}</w:t>
-            </w:r>
-          </w:p>
-        </w:tc>
-      </w:tr>
-      <w:tr>
-        <w:trPr>
-          <w:trHeight w:hRule="exact" w:val="170"/>
-        </w:trPr>
-        <w:tc>
-          <w:tcPr>
-            <w:tcW w:w="15128" w:type="dxa"/>
-            <w:gridSpan w:val="6"/>
-          </w:tcPr>
-          <w:p>
-            <w:pPr>
-              <w:spacing w:after="0" w:line="240" w:lineRule="auto"/>
-              <w:ind w:left="3005"/>
-              <w:rPr>
-                <w:rFonts w:ascii="Times New Roman" w:hAnsi="Times New Roman" w:cs="Times New Roman"/>
-                <w:sz w:val="24"/>
-                <w:szCs w:val="24"/>
-              </w:rPr>
-            </w:pPr>
-          </w:p>
-        </w:tc>
-      </w:tr>
-      <w:tr>
-        <w:trPr>
-          <w:trHeight w:hRule="exact" w:val="369"/>
-        </w:trPr>
-        <w:tc>
-          <w:tcPr>
-            <w:tcW w:w="6025" w:type="dxa"/>
-            <w:gridSpan w:val="2"/>
-          </w:tcPr>
-          <w:p>
-            <w:pPr>
-              <w:spacing w:after="0" w:line="240" w:lineRule="auto"/>
-              <w:ind w:firstLine="1276"/>
-              <w:rPr>
-                <w:rFonts w:ascii="Times New Roman" w:hAnsi="Times New Roman" w:cs="Times New Roman"/>
-                <w:sz w:val="24"/>
-                <w:szCs w:val="24"/>
-                <w:lang w:val="en-US"/>
-              </w:rPr>
-            </w:pPr>
-            <w:r>
-              <w:rPr>
-                <w:rFonts w:ascii="Times New Roman" w:hAnsi="Times New Roman" w:cs="Times New Roman"/>
-                <w:sz w:val="24"/>
-                <w:szCs w:val="24"/>
-              </w:rPr>
-              <w:t xml:space="preserve">  </w:t>
-            </w:r>
-            <w:r>
-              <w:rPr>
-                <w:rFonts w:ascii="Times New Roman" w:hAnsi="Times New Roman" w:cs="Times New Roman"/>
-                <w:sz w:val="24"/>
-                <w:szCs w:val="24"/>
-                <w:lang w:val="en-US"/>
-              </w:rPr>
-              <w:t>{{car_model}}</w:t>
-            </w:r>
-            <w:r>
-              <w:rPr>
-                <w:rFonts w:ascii="Times New Roman" w:hAnsi="Times New Roman" w:cs="Times New Roman"/>
-                <w:color w:val="C00000"/>
-                <w:sz w:val="24"/>
-                <w:szCs w:val="24"/>
-                <w:lang w:val="en-US"/>
-              </w:rPr>
-              <w:t xml:space="preserve"> </w:t>
-            </w:r>
-            <w:r>
-              <w:rPr>
-                <w:rFonts w:ascii="Times New Roman" w:hAnsi="Times New Roman" w:cs="Times New Roman"/>
-                <w:sz w:val="24"/>
-                <w:szCs w:val="24"/>
-                <w:lang w:val="en-US"/>
-              </w:rPr>
-              <w:t>{{car_plate}}</w:t>
-            </w:r>
-          </w:p>
-        </w:tc>
-        <w:tc>
-          <w:tcPr>
-            <w:tcW w:w="4582" w:type="dxa"/>
-            <w:gridSpan w:val="3"/>
-          </w:tcPr>
-          <w:p>
-            <w:pPr>
-              <w:spacing w:after="0" w:line="240" w:lineRule="auto"/>
-              <w:ind w:firstLineChars="550" w:firstLine="1320"/>
-              <w:jc w:val="both"/>
-              <w:rPr>
-                <w:rFonts w:ascii="Times New Roman" w:hAnsi="Times New Roman" w:cs="Times New Roman"/>
-                <w:sz w:val="24"/>
-                <w:szCs w:val="24"/>
-                <w:lang w:val="en-US"/>
-              </w:rPr>
-            </w:pPr>
-            <w:r>
-              <w:rPr>
-                <w:rFonts w:ascii="Times New Roman" w:hAnsi="Times New Roman" w:cs="Times New Roman"/>
-                <w:sz w:val="24"/>
-                <w:szCs w:val="24"/>
-                <w:lang w:val="en-US"/>
-              </w:rPr>
-              <w:t>{{trailer_info}}</w:t>
-            </w:r>
-          </w:p>
-        </w:tc>
-        <w:tc>
-          <w:tcPr>
-            <w:tcW w:w="4521" w:type="dxa"/>
-          </w:tcPr>
-          <w:p>
-            <w:pPr>
-              <w:spacing w:after="0" w:line="240" w:lineRule="auto"/>
-              <w:ind w:left="708"/>
+              <w:spacing w:after="0" w:line="240" w:lineRule="auto" w:before="0"/>
               <w:jc w:val="center"/>
               <w:rPr>
                 <w:rFonts w:ascii="Times New Roman" w:hAnsi="Times New Roman" w:cs="Times New Roman"/>
-                <w:sz w:val="24"/>
-                <w:szCs w:val="24"/>
-                <w:lang w:val="en-US"/>
-              </w:rPr>
-            </w:pPr>
-            <w:r>
-              <w:rPr>
-                <w:rFonts w:ascii="Times New Roman" w:hAnsi="Times New Roman" w:cs="Times New Roman"/>
-                <w:sz w:val="24"/>
-                <w:szCs w:val="24"/>
-                <w:lang w:val="en-US"/>
-              </w:rPr>
-              <w:t>{{waybill_number}}</w:t>
-            </w:r>
-          </w:p>
-        </w:tc>
-      </w:tr>
-      <w:tr>
-        <w:trPr>
-          <w:trHeight w:hRule="exact" w:val="369"/>
-        </w:trPr>
-        <w:tc>
-          <w:tcPr>
-            <w:tcW w:w="7625" w:type="dxa"/>
-            <w:gridSpan w:val="3"/>
-          </w:tcPr>
-          <w:p>
-            <w:pPr>
-              <w:spacing w:after="0" w:line="240" w:lineRule="auto"/>
-              <w:ind w:left="1985"/>
-              <w:rPr>
-                <w:rFonts w:ascii="Times New Roman" w:hAnsi="Times New Roman" w:cs="Times New Roman"/>
-                <w:sz w:val="24"/>
-                <w:szCs w:val="24"/>
-                <w:lang w:val="en-US"/>
-              </w:rPr>
-            </w:pPr>
-            <w:r>
-              <w:rPr>
-                <w:rFonts w:ascii="Times New Roman" w:hAnsi="Times New Roman" w:cs="Times New Roman"/>
-                <w:sz w:val="24"/>
-                <w:szCs w:val="24"/>
-                <w:lang w:val="en-US"/>
-              </w:rPr>
-              <w:t>{{driver_name}}</w:t>
-            </w:r>
-          </w:p>
-        </w:tc>
-        <w:tc>
-          <w:tcPr>
-            <w:tcW w:w="7503" w:type="dxa"/>
-            <w:gridSpan w:val="3"/>
-          </w:tcPr>
-          <w:p>
-            <w:pPr>
-              <w:spacing w:after="0" w:line="240" w:lineRule="auto"/>
-              <w:ind w:left="4203"/>
-              <w:rPr>
-                <w:rFonts w:ascii="Times New Roman" w:hAnsi="Times New Roman" w:cs="Times New Roman"/>
-                <w:sz w:val="24"/>
-                <w:szCs w:val="24"/>
-              </w:rPr>
-            </w:pPr>
-          </w:p>
-        </w:tc>
-      </w:tr>
-      <w:tr>
-        <w:trPr>
-          <w:trHeight w:hRule="exact" w:val="369"/>
-        </w:trPr>
-        <w:tc>
-          <w:tcPr>
-            <w:tcW w:w="15128" w:type="dxa"/>
-            <w:gridSpan w:val="6"/>
-          </w:tcPr>
-          <w:p>
-            <w:pPr>
-              <w:spacing w:after="0" w:line="240" w:lineRule="auto"/>
-              <w:ind w:left="4248"/>
-              <w:rPr>
-                <w:rFonts w:ascii="Times New Roman" w:hAnsi="Times New Roman" w:cs="Times New Roman"/>
-                <w:sz w:val="24"/>
-                <w:szCs w:val="24"/>
-                <w:lang w:val="en-US"/>
-              </w:rPr>
-            </w:pPr>
-            <w:r>
-              <w:rPr>
-                <w:rFonts w:ascii="Times New Roman" w:hAnsi="Times New Roman" w:cs="Times New Roman"/>
-                <w:sz w:val="24"/>
-                <w:szCs w:val="24"/>
-                <w:lang w:val="en-US"/>
-              </w:rPr>
-              <w:t>{{customer}}</w:t>
-            </w:r>
-          </w:p>
-        </w:tc>
-      </w:tr>
-      <w:tr>
-        <w:trPr>
-          <w:trHeight w:hRule="exact" w:val="369"/>
-        </w:trPr>
-        <w:tc>
-          <w:tcPr>
-            <w:tcW w:w="15128" w:type="dxa"/>
-            <w:gridSpan w:val="6"/>
-          </w:tcPr>
-          <w:p>
-            <w:pPr>
-              <w:spacing w:after="0" w:line="240" w:lineRule="auto"/>
-              <w:ind w:left="1985"/>
-              <w:rPr>
-                <w:rFonts w:ascii="Times New Roman" w:hAnsi="Times New Roman" w:cs="Times New Roman"/>
-                <w:sz w:val="24"/>
-                <w:szCs w:val="24"/>
-                <w:lang w:val="en-US"/>
-              </w:rPr>
-            </w:pPr>
-            <w:r>
-              <w:rPr>
-                <w:rFonts w:ascii="Times New Roman" w:hAnsi="Times New Roman" w:cs="Times New Roman"/>
-                <w:sz w:val="24"/>
-                <w:szCs w:val="24"/>
-                <w:lang w:val="en-US"/>
-              </w:rPr>
-              <w:t>{{shipper}}</w:t>
-            </w:r>
-          </w:p>
-        </w:tc>
-      </w:tr>
-      <w:tr>
-        <w:trPr>
-          <w:trHeight w:hRule="exact" w:val="369"/>
-        </w:trPr>
-        <w:tc>
-          <w:tcPr>
-            <w:tcW w:w="15128" w:type="dxa"/>
-            <w:gridSpan w:val="6"/>
-          </w:tcPr>
-          <w:p>
-            <w:pPr>
-              <w:spacing w:after="0" w:line="240" w:lineRule="auto"/>
-              <w:ind w:left="2124"/>
-              <w:rPr>
-                <w:rFonts w:ascii="Times New Roman" w:hAnsi="Times New Roman" w:cs="Times New Roman"/>
-                <w:sz w:val="24"/>
-                <w:szCs w:val="24"/>
-                <w:lang w:val="en-US"/>
-              </w:rPr>
-            </w:pPr>
-            <w:r>
-              <w:rPr>
-                <w:rFonts w:ascii="Times New Roman" w:hAnsi="Times New Roman" w:cs="Times New Roman"/>
-                <w:sz w:val="24"/>
-                <w:szCs w:val="24"/>
-                <w:lang w:val="en-US"/>
-              </w:rPr>
-              <w:t>{{consignee}}</w:t>
-            </w:r>
-          </w:p>
-        </w:tc>
-      </w:tr>
-      <w:tr>
-        <w:trPr>
-          <w:trHeight w:hRule="exact" w:val="369"/>
-        </w:trPr>
-        <w:tc>
-          <w:tcPr>
-            <w:tcW w:w="6025" w:type="dxa"/>
-            <w:gridSpan w:val="2"/>
-          </w:tcPr>
-          <w:p>
-            <w:pPr>
-              <w:spacing w:after="0" w:line="240" w:lineRule="auto"/>
-              <w:ind w:left="1701"/>
-              <w:jc w:val="both"/>
-              <w:rPr>
-                <w:rFonts w:ascii="Times New Roman" w:hAnsi="Times New Roman" w:cs="Times New Roman"/>
-                <w:sz w:val="24"/>
-                <w:szCs w:val="24"/>
-                <w:lang w:val="en-US"/>
-              </w:rPr>
-            </w:pPr>
-            <w:r>
-              <w:rPr>
-                <w:rFonts w:ascii="Times New Roman" w:hAnsi="Times New Roman" w:cs="Times New Roman"/>
-                <w:sz w:val="24"/>
-                <w:szCs w:val="24"/>
-                <w:lang w:val="en-US"/>
-              </w:rPr>
-              <w:t>{{release_basis}}</w:t>
-            </w:r>
-          </w:p>
-        </w:tc>
-        <w:tc>
-          <w:tcPr>
-            <w:tcW w:w="9103" w:type="dxa"/>
-            <w:gridSpan w:val="4"/>
-          </w:tcPr>
-          <w:p>
-            <w:pPr>
-              <w:spacing w:after="0" w:line="240" w:lineRule="auto"/>
-              <w:ind w:left="2124"/>
-              <w:jc w:val="center"/>
-              <w:rPr>
-                <w:rFonts w:ascii="Times New Roman" w:hAnsi="Times New Roman" w:cs="Times New Roman"/>
-                <w:sz w:val="24"/>
-                <w:szCs w:val="24"/>
-                <w:lang w:val="en-US"/>
-              </w:rPr>
-            </w:pPr>
-            <w:r>
-              <w:rPr>
-                <w:rFonts w:ascii="Times New Roman" w:hAnsi="Times New Roman" w:cs="Times New Roman"/>
-                <w:sz w:val="24"/>
-                <w:szCs w:val="24"/>
-                <w:lang w:val="en-US"/>
-              </w:rPr>
-              <w:t>{{loading_point}}</w:t>
-            </w:r>
-          </w:p>
-        </w:tc>
-      </w:tr>
-      <w:tr>
-        <w:trPr>
-          <w:trHeight w:hRule="exact" w:val="369"/>
-        </w:trPr>
-        <w:tc>
-          <w:tcPr>
-            <w:tcW w:w="15128" w:type="dxa"/>
-            <w:gridSpan w:val="6"/>
-          </w:tcPr>
-          <w:p>
-            <w:pPr>
-              <w:spacing w:after="0" w:line="240" w:lineRule="auto"/>
-              <w:ind w:firstLineChars="700" w:firstLine="1680"/>
-              <w:rPr>
-                <w:rFonts w:ascii="Times New Roman" w:hAnsi="Times New Roman" w:cs="Times New Roman"/>
-                <w:sz w:val="24"/>
-                <w:szCs w:val="24"/>
-              </w:rPr>
-            </w:pPr>
-            <w:r>
-              <w:rPr>
-                <w:rFonts w:ascii="Times New Roman" w:hAnsi="Times New Roman" w:cs="Times New Roman"/>
-                <w:sz w:val="24"/>
-                <w:szCs w:val="24"/>
-                <w:lang w:val="en-US"/>
-              </w:rPr>
-              <w:t>{{unloading_point}}</w:t>
+                <w:szCs w:val="24"/>
+              </w:rPr>
+            </w:pPr>
+            <w:r>
+              <w:rPr>
+                <w:rFonts w:ascii="Times New Roman" w:hAnsi="Times New Roman" w:cs="Times New Roman" w:eastAsia="Times New Roman"/>
+                <w:b w:val="0"/>
+                <w:sz w:val="18"/>
+                <w:szCs w:val="24"/>
+                <w:lang w:val="en-US"/>
+              </w:rPr>
+              <w:t>{{customer_unp}}</w:t>
             </w:r>
           </w:p>
         </w:tc>
@@ -624,36 +123,261 @@
     </w:tbl>
     <w:p>
       <w:pPr>
-        <w:rPr>
-          <w:rFonts w:ascii="Times New Roman" w:hAnsi="Times New Roman" w:cs="Times New Roman"/>
-          <w:sz w:val="24"/>
-          <w:szCs w:val="24"/>
-        </w:rPr>
+        <w:keepLines/>
+        <w:tabs>
+          <w:tab w:pos="194" w:val="left"/>
+          <w:tab w:pos="868" w:val="left"/>
+          <w:tab w:pos="3845" w:val="left"/>
+        </w:tabs>
+        <w:spacing w:before="1321" w:after="0" w:line="200" w:lineRule="exact"/>
+        <w:ind w:left="0" w:firstLine="0"/>
       </w:pPr>
+      <w:r>
+        <w:rPr>
+          <w:rFonts w:ascii="Times New Roman" w:hAnsi="Times New Roman" w:cs="Times New Roman" w:eastAsia="Times New Roman"/>
+          <w:b w:val="0"/>
+          <w:sz w:val="19"/>
+        </w:rPr>
+        <w:tab/>
+      </w:r>
+      <w:r>
+        <w:rPr>
+          <w:rFonts w:ascii="Times New Roman" w:hAnsi="Times New Roman" w:cs="Times New Roman" w:eastAsia="Times New Roman"/>
+          <w:b w:val="0"/>
+          <w:sz w:val="19"/>
+        </w:rPr>
+        <w:t>{{day}}</w:t>
+      </w:r>
+      <w:r>
+        <w:rPr>
+          <w:rFonts w:ascii="Times New Roman" w:hAnsi="Times New Roman" w:cs="Times New Roman" w:eastAsia="Times New Roman"/>
+          <w:b w:val="0"/>
+          <w:sz w:val="19"/>
+        </w:rPr>
+        <w:tab/>
+      </w:r>
+      <w:r>
+        <w:rPr>
+          <w:rFonts w:ascii="Times New Roman" w:hAnsi="Times New Roman" w:cs="Times New Roman" w:eastAsia="Times New Roman"/>
+          <w:b w:val="0"/>
+          <w:sz w:val="19"/>
+        </w:rPr>
+        <w:t>{{month}}</w:t>
+      </w:r>
+      <w:r>
+        <w:rPr>
+          <w:rFonts w:ascii="Times New Roman" w:hAnsi="Times New Roman" w:cs="Times New Roman" w:eastAsia="Times New Roman"/>
+          <w:b w:val="0"/>
+          <w:sz w:val="19"/>
+        </w:rPr>
+        <w:tab/>
+      </w:r>
+      <w:r>
+        <w:rPr>
+          <w:rFonts w:ascii="Times New Roman" w:hAnsi="Times New Roman" w:cs="Times New Roman" w:eastAsia="Times New Roman"/>
+          <w:b w:val="0"/>
+          <w:sz w:val="19"/>
+        </w:rPr>
+        <w:t>{{year}}</w:t>
+      </w:r>
     </w:p>
     <w:p>
       <w:pPr>
-        <w:rPr>
-          <w:rFonts w:ascii="Times New Roman" w:hAnsi="Times New Roman" w:cs="Times New Roman"/>
-          <w:sz w:val="24"/>
-          <w:szCs w:val="24"/>
-        </w:rPr>
+        <w:keepLines/>
+        <w:tabs>
+          <w:tab w:pos="1253" w:val="left"/>
+          <w:tab w:pos="9069" w:val="left"/>
+          <w:tab w:pos="14179" w:val="left"/>
+        </w:tabs>
+        <w:spacing w:before="21" w:after="0" w:line="200" w:lineRule="exact"/>
+        <w:ind w:left="0" w:firstLine="0"/>
       </w:pPr>
+      <w:r>
+        <w:rPr>
+          <w:rFonts w:ascii="Times New Roman" w:hAnsi="Times New Roman" w:cs="Times New Roman" w:eastAsia="Times New Roman"/>
+          <w:b w:val="0"/>
+          <w:sz w:val="19"/>
+        </w:rPr>
+        <w:tab/>
+      </w:r>
+      <w:r>
+        <w:rPr>
+          <w:rFonts w:ascii="Times New Roman" w:hAnsi="Times New Roman" w:cs="Times New Roman" w:eastAsia="Times New Roman"/>
+          <w:b w:val="0"/>
+          <w:sz w:val="19"/>
+        </w:rPr>
+        <w:t>{{car_model}} {{car_plate}}</w:t>
+      </w:r>
+      <w:r>
+        <w:rPr>
+          <w:rFonts w:ascii="Times New Roman" w:hAnsi="Times New Roman" w:cs="Times New Roman" w:eastAsia="Times New Roman"/>
+          <w:b w:val="0"/>
+          <w:sz w:val="19"/>
+        </w:rPr>
+        <w:tab/>
+      </w:r>
+      <w:r>
+        <w:rPr>
+          <w:rFonts w:ascii="Times New Roman" w:hAnsi="Times New Roman" w:cs="Times New Roman" w:eastAsia="Times New Roman"/>
+          <w:b w:val="0"/>
+          <w:sz w:val="19"/>
+        </w:rPr>
+        <w:t>{{trailer_info}}</w:t>
+      </w:r>
+      <w:r>
+        <w:rPr>
+          <w:rFonts w:ascii="Times New Roman" w:hAnsi="Times New Roman" w:cs="Times New Roman" w:eastAsia="Times New Roman"/>
+          <w:b w:val="0"/>
+          <w:sz w:val="19"/>
+        </w:rPr>
+        <w:tab/>
+      </w:r>
+      <w:r>
+        <w:rPr>
+          <w:rFonts w:ascii="Times New Roman" w:hAnsi="Times New Roman" w:cs="Times New Roman" w:eastAsia="Times New Roman"/>
+          <w:b w:val="0"/>
+          <w:sz w:val="19"/>
+        </w:rPr>
+        <w:t>{{waybill_number}}</w:t>
+      </w:r>
     </w:p>
     <w:p>
       <w:pPr>
-        <w:rPr>
-          <w:rFonts w:ascii="Times New Roman" w:hAnsi="Times New Roman" w:cs="Times New Roman"/>
-          <w:sz w:val="24"/>
-          <w:szCs w:val="24"/>
-        </w:rPr>
+        <w:keepLines/>
+        <w:spacing w:before="297" w:after="0" w:line="200" w:lineRule="exact"/>
+        <w:ind w:left="964" w:firstLine="0"/>
       </w:pPr>
+      <w:r>
+        <w:rPr>
+          <w:rFonts w:ascii="Times New Roman" w:hAnsi="Times New Roman" w:cs="Times New Roman" w:eastAsia="Times New Roman"/>
+          <w:b w:val="0"/>
+          <w:sz w:val="19"/>
+        </w:rPr>
+        <w:t>{{driver_name}}</w:t>
+      </w:r>
+    </w:p>
+    <w:p>
+      <w:pPr>
+        <w:keepLines/>
+        <w:spacing w:before="443" w:after="0" w:line="200" w:lineRule="exact"/>
+        <w:ind w:left="4180" w:firstLine="0"/>
+      </w:pPr>
+      <w:r>
+        <w:rPr>
+          <w:rFonts w:ascii="Times New Roman" w:hAnsi="Times New Roman" w:cs="Times New Roman" w:eastAsia="Times New Roman"/>
+          <w:b w:val="0"/>
+          <w:sz w:val="19"/>
+        </w:rPr>
+        <w:t>{{customer}}</w:t>
+      </w:r>
+    </w:p>
+    <w:p>
+      <w:pPr>
+        <w:keepLines/>
+        <w:spacing w:before="238" w:after="0" w:line="200" w:lineRule="exact"/>
+        <w:ind w:left="2109" w:firstLine="0"/>
+      </w:pPr>
+      <w:r>
+        <w:rPr>
+          <w:rFonts w:ascii="Times New Roman" w:hAnsi="Times New Roman" w:cs="Times New Roman" w:eastAsia="Times New Roman"/>
+          <w:b w:val="0"/>
+          <w:sz w:val="19"/>
+        </w:rPr>
+        <w:t>{{shipper}}</w:t>
+      </w:r>
+    </w:p>
+    <w:p>
+      <w:pPr>
+        <w:keepLines/>
+        <w:spacing w:before="254" w:after="0" w:line="200" w:lineRule="exact"/>
+        <w:ind w:left="2109" w:firstLine="0"/>
+      </w:pPr>
+      <w:r>
+        <w:rPr>
+          <w:rFonts w:ascii="Times New Roman" w:hAnsi="Times New Roman" w:cs="Times New Roman" w:eastAsia="Times New Roman"/>
+          <w:b w:val="0"/>
+          <w:sz w:val="19"/>
+        </w:rPr>
+        <w:t>{{consignee}}</w:t>
+      </w:r>
+    </w:p>
+    <w:p>
+      <w:pPr>
+        <w:keepLines/>
+        <w:tabs>
+          <w:tab w:pos="2014" w:val="left"/>
+          <w:tab w:pos="7912" w:val="left"/>
+          <w:tab w:pos="12251" w:val="left"/>
+        </w:tabs>
+        <w:spacing w:before="240" w:after="0" w:line="200" w:lineRule="exact"/>
+        <w:ind w:left="0" w:firstLine="0"/>
+      </w:pPr>
+      <w:r>
+        <w:rPr>
+          <w:rFonts w:ascii="Times New Roman" w:hAnsi="Times New Roman" w:cs="Times New Roman" w:eastAsia="Times New Roman"/>
+          <w:b w:val="0"/>
+          <w:sz w:val="19"/>
+        </w:rPr>
+        <w:tab/>
+      </w:r>
+      <w:r>
+        <w:rPr>
+          <w:rFonts w:ascii="Times New Roman" w:hAnsi="Times New Roman" w:cs="Times New Roman" w:eastAsia="Times New Roman"/>
+          <w:b w:val="0"/>
+          <w:sz w:val="19"/>
+        </w:rPr>
+        <w:t>{{release_basis}}</w:t>
+      </w:r>
+      <w:r>
+        <w:rPr>
+          <w:rFonts w:ascii="Times New Roman" w:hAnsi="Times New Roman" w:cs="Times New Roman" w:eastAsia="Times New Roman"/>
+          <w:b w:val="0"/>
+          <w:sz w:val="19"/>
+        </w:rPr>
+        <w:tab/>
+      </w:r>
+      <w:r>
+        <w:rPr>
+          <w:rFonts w:ascii="Times New Roman" w:hAnsi="Times New Roman" w:cs="Times New Roman" w:eastAsia="Times New Roman"/>
+          <w:b w:val="0"/>
+          <w:sz w:val="19"/>
+        </w:rPr>
+        <w:t>{{loading_point}}</w:t>
+      </w:r>
+      <w:r>
+        <w:rPr>
+          <w:rFonts w:ascii="Times New Roman" w:hAnsi="Times New Roman" w:cs="Times New Roman" w:eastAsia="Times New Roman"/>
+          <w:b w:val="0"/>
+          <w:sz w:val="19"/>
+        </w:rPr>
+        <w:tab/>
+      </w:r>
+      <w:r>
+        <w:rPr>
+          <w:rFonts w:ascii="Times New Roman" w:hAnsi="Times New Roman" w:cs="Times New Roman" w:eastAsia="Times New Roman"/>
+          <w:b w:val="0"/>
+          <w:sz w:val="19"/>
+        </w:rPr>
+        <w:t>{{unloading_point}}</w:t>
+      </w:r>
+    </w:p>
+    <w:p>
+      <w:pPr>
+        <w:spacing w:before="0" w:after="0" w:line="2148" w:lineRule="exact"/>
+      </w:pPr>
+      <w:r>
+        <w:rPr>
+          <w:rFonts w:ascii="Times New Roman" w:hAnsi="Times New Roman" w:cs="Times New Roman" w:eastAsia="Times New Roman"/>
+          <w:b w:val="0"/>
+          <w:sz w:val="2"/>
+        </w:rPr>
+      </w:r>
     </w:p>
     <w:tbl>
       <w:tblPr>
         <w:tblStyle w:val="a5"/>
-        <w:tblW w:w="14757" w:type="dxa"/>
-        <w:tblInd w:w="392" w:type="dxa"/>
+        <w:tblW w:w="14969" w:type="dxa"/>
+        <w:tblInd w:w="0" w:type="dxa"/>
         <w:tblBorders>
           <w:top w:val="none" w:sz="0" w:space="0" w:color="auto"/>
           <w:left w:val="none" w:sz="0" w:space="0" w:color="auto"/>
@@ -666,127 +390,215 @@
         <w:tblLook w:val="04A0" w:firstRow="1" w:lastRow="0" w:firstColumn="1" w:lastColumn="0" w:noHBand="0" w:noVBand="1"/>
       </w:tblPr>
       <w:tblGrid>
-        <w:gridCol w:w="3610"/>
-        <w:gridCol w:w="749"/>
-        <w:gridCol w:w="778"/>
-        <w:gridCol w:w="1428"/>
-        <w:gridCol w:w="1236"/>
-        <w:gridCol w:w="700"/>
-        <w:gridCol w:w="1094"/>
-        <w:gridCol w:w="1691"/>
-        <w:gridCol w:w="734"/>
-        <w:gridCol w:w="1160"/>
-        <w:gridCol w:w="1577"/>
+        <w:gridCol w:w="4344"/>
+        <w:gridCol w:w="1157"/>
+        <w:gridCol w:w="772"/>
+        <w:gridCol w:w="1157"/>
+        <w:gridCol w:w="1253"/>
+        <w:gridCol w:w="1060"/>
+        <w:gridCol w:w="1062"/>
+        <w:gridCol w:w="1351"/>
+        <w:gridCol w:w="964"/>
+        <w:gridCol w:w="868"/>
+        <w:gridCol w:w="981"/>
       </w:tblGrid>
       <w:tr>
         <w:tc>
           <w:tcPr>
-            <w:tcW w:w="3610" w:type="dxa"/>
-          </w:tcPr>
-          <w:p>
-            <w:r>
+            <w:tcW w:w="4344" w:type="dxa"/>
+          </w:tcPr>
+          <w:p>
+            <w:pPr>
+              <w:spacing w:before="0" w:after="0" w:line="240" w:lineRule="auto"/>
+            </w:pPr>
+            <w:r>
+              <w:rPr>
+                <w:rFonts w:ascii="Times New Roman" w:hAnsi="Times New Roman" w:cs="Times New Roman" w:eastAsia="Times New Roman"/>
+                <w:b w:val="0"/>
+                <w:sz w:val="18"/>
+              </w:rPr>
               <w:t>{</w:t>
             </w:r>
             <w:r>
+              <w:rPr>
+                <w:rFonts w:ascii="Times New Roman" w:hAnsi="Times New Roman" w:cs="Times New Roman" w:eastAsia="Times New Roman"/>
+                <w:b w:val="0"/>
+                <w:sz w:val="18"/>
+              </w:rPr>
               <w:t>{cargo.cargo_name}}</w:t>
             </w:r>
           </w:p>
         </w:tc>
         <w:tc>
           <w:tcPr>
-            <w:tcW w:w="749" w:type="dxa"/>
-          </w:tcPr>
-          <w:p>
-            <w:r>
+            <w:tcW w:w="1157" w:type="dxa"/>
+          </w:tcPr>
+          <w:p>
+            <w:pPr>
+              <w:spacing w:before="0" w:after="0" w:line="240" w:lineRule="auto"/>
+            </w:pPr>
+            <w:r>
+              <w:rPr>
+                <w:rFonts w:ascii="Times New Roman" w:hAnsi="Times New Roman" w:cs="Times New Roman" w:eastAsia="Times New Roman"/>
+                <w:b w:val="0"/>
+                <w:sz w:val="18"/>
+              </w:rPr>
               <w:t>{{cargo.si}}</w:t>
             </w:r>
           </w:p>
         </w:tc>
         <w:tc>
           <w:tcPr>
-            <w:tcW w:w="778" w:type="dxa"/>
-          </w:tcPr>
-          <w:p>
-            <w:r>
+            <w:tcW w:w="772" w:type="dxa"/>
+          </w:tcPr>
+          <w:p>
+            <w:pPr>
+              <w:spacing w:before="0" w:after="0" w:line="240" w:lineRule="auto"/>
+            </w:pPr>
+            <w:r>
+              <w:rPr>
+                <w:rFonts w:ascii="Times New Roman" w:hAnsi="Times New Roman" w:cs="Times New Roman" w:eastAsia="Times New Roman"/>
+                <w:b w:val="0"/>
+                <w:sz w:val="18"/>
+              </w:rPr>
               <w:t>{{cargo.unit}}</w:t>
             </w:r>
           </w:p>
         </w:tc>
         <w:tc>
           <w:tcPr>
-            <w:tcW w:w="1428" w:type="dxa"/>
-          </w:tcPr>
-          <w:p>
-            <w:r>
+            <w:tcW w:w="1157" w:type="dxa"/>
+          </w:tcPr>
+          <w:p>
+            <w:pPr>
+              <w:spacing w:before="0" w:after="0" w:line="240" w:lineRule="auto"/>
+            </w:pPr>
+            <w:r>
+              <w:rPr>
+                <w:rFonts w:ascii="Times New Roman" w:hAnsi="Times New Roman" w:cs="Times New Roman" w:eastAsia="Times New Roman"/>
+                <w:b w:val="0"/>
+                <w:sz w:val="18"/>
+              </w:rPr>
               <w:t>{{cargo.price}}</w:t>
             </w:r>
           </w:p>
         </w:tc>
         <w:tc>
           <w:tcPr>
-            <w:tcW w:w="1236" w:type="dxa"/>
-          </w:tcPr>
-          <w:p>
-            <w:r>
+            <w:tcW w:w="1253" w:type="dxa"/>
+          </w:tcPr>
+          <w:p>
+            <w:pPr>
+              <w:spacing w:before="0" w:after="0" w:line="240" w:lineRule="auto"/>
+            </w:pPr>
+            <w:r>
+              <w:rPr>
+                <w:rFonts w:ascii="Times New Roman" w:hAnsi="Times New Roman" w:cs="Times New Roman" w:eastAsia="Times New Roman"/>
+                <w:b w:val="0"/>
+                <w:sz w:val="18"/>
+              </w:rPr>
               <w:t>{{cargo.total_cost}}</w:t>
             </w:r>
           </w:p>
         </w:tc>
         <w:tc>
           <w:tcPr>
-            <w:tcW w:w="700" w:type="dxa"/>
-          </w:tcPr>
-          <w:p>
-            <w:r>
+            <w:tcW w:w="1060" w:type="dxa"/>
+          </w:tcPr>
+          <w:p>
+            <w:pPr>
+              <w:spacing w:before="0" w:after="0" w:line="240" w:lineRule="auto"/>
+            </w:pPr>
+            <w:r>
+              <w:rPr>
+                <w:rFonts w:ascii="Times New Roman" w:hAnsi="Times New Roman" w:cs="Times New Roman" w:eastAsia="Times New Roman"/>
+                <w:b w:val="0"/>
+                <w:sz w:val="18"/>
+              </w:rPr>
               <w:t>{{cargo.vat_rate}}</w:t>
             </w:r>
           </w:p>
         </w:tc>
         <w:tc>
           <w:tcPr>
-            <w:tcW w:w="1094" w:type="dxa"/>
-          </w:tcPr>
-          <w:p>
-            <w:r>
+            <w:tcW w:w="1062" w:type="dxa"/>
+          </w:tcPr>
+          <w:p>
+            <w:pPr>
+              <w:spacing w:before="0" w:after="0" w:line="240" w:lineRule="auto"/>
+            </w:pPr>
+            <w:r>
+              <w:rPr>
+                <w:rFonts w:ascii="Times New Roman" w:hAnsi="Times New Roman" w:cs="Times New Roman" w:eastAsia="Times New Roman"/>
+                <w:b w:val="0"/>
+                <w:sz w:val="18"/>
+              </w:rPr>
               <w:t>{{cargo.vat_cost}}</w:t>
             </w:r>
           </w:p>
         </w:tc>
         <w:tc>
           <w:tcPr>
-            <w:tcW w:w="1691" w:type="dxa"/>
-          </w:tcPr>
-          <w:p>
-            <w:r>
+            <w:tcW w:w="1351" w:type="dxa"/>
+          </w:tcPr>
+          <w:p>
+            <w:pPr>
+              <w:spacing w:before="0" w:after="0" w:line="240" w:lineRule="auto"/>
+            </w:pPr>
+            <w:r>
+              <w:rPr>
+                <w:rFonts w:ascii="Times New Roman" w:hAnsi="Times New Roman" w:cs="Times New Roman" w:eastAsia="Times New Roman"/>
+                <w:b w:val="0"/>
+                <w:sz w:val="18"/>
+              </w:rPr>
               <w:t>{{cargo.total_with_vat}}</w:t>
             </w:r>
           </w:p>
         </w:tc>
         <w:tc>
           <w:tcPr>
-            <w:tcW w:w="734" w:type="dxa"/>
-          </w:tcPr>
-          <w:p>
-            <w:r>
+            <w:tcW w:w="964" w:type="dxa"/>
+          </w:tcPr>
+          <w:p>
+            <w:pPr>
+              <w:spacing w:before="0" w:after="0" w:line="240" w:lineRule="auto"/>
+            </w:pPr>
+            <w:r>
+              <w:rPr>
+                <w:rFonts w:ascii="Times New Roman" w:hAnsi="Times New Roman" w:cs="Times New Roman" w:eastAsia="Times New Roman"/>
+                <w:b w:val="0"/>
+                <w:sz w:val="18"/>
+              </w:rPr>
               <w:t>{{cargo.places}}</w:t>
             </w:r>
           </w:p>
         </w:tc>
         <w:tc>
           <w:tcPr>
-            <w:tcW w:w="1160" w:type="dxa"/>
-          </w:tcPr>
-          <w:p>
-            <w:r>
+            <w:tcW w:w="868" w:type="dxa"/>
+          </w:tcPr>
+          <w:p>
+            <w:pPr>
+              <w:spacing w:before="0" w:after="0" w:line="240" w:lineRule="auto"/>
+            </w:pPr>
+            <w:r>
+              <w:rPr>
+                <w:rFonts w:ascii="Times New Roman" w:hAnsi="Times New Roman" w:cs="Times New Roman" w:eastAsia="Times New Roman"/>
+                <w:b w:val="0"/>
+                <w:sz w:val="18"/>
+              </w:rPr>
               <w:t>{{cargo.cargo_qty}}</w:t>
             </w:r>
           </w:p>
         </w:tc>
         <w:tc>
           <w:tcPr>
-            <w:tcW w:w="1577" w:type="dxa"/>
-          </w:tcPr>
-          <w:p>
+            <w:tcW w:w="981" w:type="dxa"/>
+          </w:tcPr>
+          <w:p>
+            <w:pPr>
+              <w:spacing w:before="0" w:after="0" w:line="240" w:lineRule="auto"/>
+            </w:pPr>
             <w:bookmarkStart w:id="0" w:name="_GoBack"/>
             <w:bookmarkEnd w:id="0"/>
           </w:p>

</xml_diff>

<commit_message>
Restore date position and center cargo columns
</commit_message>
<xml_diff>
--- a/assets/Шаблон_ТТН_демо.docx
+++ b/assets/Шаблон_ТТН_демо.docx
@@ -125,18 +125,18 @@
       <w:pPr>
         <w:keepLines/>
         <w:tabs>
-          <w:tab w:pos="194" w:val="left"/>
-          <w:tab w:pos="868" w:val="left"/>
-          <w:tab w:pos="3845" w:val="left"/>
+          <w:tab w:pos="5037" w:val="left"/>
+          <w:tab w:pos="6425" w:val="left"/>
+          <w:tab w:pos="7735" w:val="left"/>
         </w:tabs>
-        <w:spacing w:before="1321" w:after="0" w:line="200" w:lineRule="exact"/>
+        <w:spacing w:before="191" w:after="0" w:line="264" w:lineRule="exact"/>
         <w:ind w:left="0" w:firstLine="0"/>
       </w:pPr>
       <w:r>
         <w:rPr>
           <w:rFonts w:ascii="Times New Roman" w:hAnsi="Times New Roman" w:cs="Times New Roman" w:eastAsia="Times New Roman"/>
           <w:b w:val="0"/>
-          <w:sz w:val="19"/>
+          <w:sz w:val="24"/>
         </w:rPr>
         <w:tab/>
       </w:r>
@@ -144,7 +144,7 @@
         <w:rPr>
           <w:rFonts w:ascii="Times New Roman" w:hAnsi="Times New Roman" w:cs="Times New Roman" w:eastAsia="Times New Roman"/>
           <w:b w:val="0"/>
-          <w:sz w:val="19"/>
+          <w:sz w:val="24"/>
         </w:rPr>
         <w:t>{{day}}</w:t>
       </w:r>
@@ -152,7 +152,7 @@
         <w:rPr>
           <w:rFonts w:ascii="Times New Roman" w:hAnsi="Times New Roman" w:cs="Times New Roman" w:eastAsia="Times New Roman"/>
           <w:b w:val="0"/>
-          <w:sz w:val="19"/>
+          <w:sz w:val="24"/>
         </w:rPr>
         <w:tab/>
       </w:r>
@@ -160,7 +160,7 @@
         <w:rPr>
           <w:rFonts w:ascii="Times New Roman" w:hAnsi="Times New Roman" w:cs="Times New Roman" w:eastAsia="Times New Roman"/>
           <w:b w:val="0"/>
-          <w:sz w:val="19"/>
+          <w:sz w:val="24"/>
         </w:rPr>
         <w:t>{{month}}</w:t>
       </w:r>
@@ -168,7 +168,7 @@
         <w:rPr>
           <w:rFonts w:ascii="Times New Roman" w:hAnsi="Times New Roman" w:cs="Times New Roman" w:eastAsia="Times New Roman"/>
           <w:b w:val="0"/>
-          <w:sz w:val="19"/>
+          <w:sz w:val="24"/>
         </w:rPr>
         <w:tab/>
       </w:r>
@@ -176,7 +176,7 @@
         <w:rPr>
           <w:rFonts w:ascii="Times New Roman" w:hAnsi="Times New Roman" w:cs="Times New Roman" w:eastAsia="Times New Roman"/>
           <w:b w:val="0"/>
-          <w:sz w:val="19"/>
+          <w:sz w:val="24"/>
         </w:rPr>
         <w:t>{{year}}</w:t>
       </w:r>
@@ -189,7 +189,7 @@
           <w:tab w:pos="9069" w:val="left"/>
           <w:tab w:pos="14179" w:val="left"/>
         </w:tabs>
-        <w:spacing w:before="21" w:after="0" w:line="200" w:lineRule="exact"/>
+        <w:spacing w:before="1087" w:after="0" w:line="200" w:lineRule="exact"/>
         <w:ind w:left="0" w:firstLine="0"/>
       </w:pPr>
       <w:r>
@@ -406,10 +406,12 @@
         <w:tc>
           <w:tcPr>
             <w:tcW w:w="4344" w:type="dxa"/>
+            <w:vAlign w:val="center"/>
           </w:tcPr>
           <w:p>
             <w:pPr>
               <w:spacing w:before="0" w:after="0" w:line="240" w:lineRule="auto"/>
+              <w:jc w:val="left"/>
             </w:pPr>
             <w:r>
               <w:rPr>
@@ -432,10 +434,12 @@
         <w:tc>
           <w:tcPr>
             <w:tcW w:w="1157" w:type="dxa"/>
+            <w:vAlign w:val="center"/>
           </w:tcPr>
           <w:p>
             <w:pPr>
               <w:spacing w:before="0" w:after="0" w:line="240" w:lineRule="auto"/>
+              <w:jc w:val="center"/>
             </w:pPr>
             <w:r>
               <w:rPr>
@@ -450,10 +454,12 @@
         <w:tc>
           <w:tcPr>
             <w:tcW w:w="772" w:type="dxa"/>
+            <w:vAlign w:val="center"/>
           </w:tcPr>
           <w:p>
             <w:pPr>
               <w:spacing w:before="0" w:after="0" w:line="240" w:lineRule="auto"/>
+              <w:jc w:val="center"/>
             </w:pPr>
             <w:r>
               <w:rPr>
@@ -468,10 +474,12 @@
         <w:tc>
           <w:tcPr>
             <w:tcW w:w="1157" w:type="dxa"/>
+            <w:vAlign w:val="center"/>
           </w:tcPr>
           <w:p>
             <w:pPr>
               <w:spacing w:before="0" w:after="0" w:line="240" w:lineRule="auto"/>
+              <w:jc w:val="center"/>
             </w:pPr>
             <w:r>
               <w:rPr>
@@ -486,10 +494,12 @@
         <w:tc>
           <w:tcPr>
             <w:tcW w:w="1253" w:type="dxa"/>
+            <w:vAlign w:val="center"/>
           </w:tcPr>
           <w:p>
             <w:pPr>
               <w:spacing w:before="0" w:after="0" w:line="240" w:lineRule="auto"/>
+              <w:jc w:val="center"/>
             </w:pPr>
             <w:r>
               <w:rPr>
@@ -504,10 +514,12 @@
         <w:tc>
           <w:tcPr>
             <w:tcW w:w="1060" w:type="dxa"/>
+            <w:vAlign w:val="center"/>
           </w:tcPr>
           <w:p>
             <w:pPr>
               <w:spacing w:before="0" w:after="0" w:line="240" w:lineRule="auto"/>
+              <w:jc w:val="center"/>
             </w:pPr>
             <w:r>
               <w:rPr>
@@ -522,10 +534,12 @@
         <w:tc>
           <w:tcPr>
             <w:tcW w:w="1062" w:type="dxa"/>
+            <w:vAlign w:val="center"/>
           </w:tcPr>
           <w:p>
             <w:pPr>
               <w:spacing w:before="0" w:after="0" w:line="240" w:lineRule="auto"/>
+              <w:jc w:val="center"/>
             </w:pPr>
             <w:r>
               <w:rPr>
@@ -540,10 +554,12 @@
         <w:tc>
           <w:tcPr>
             <w:tcW w:w="1351" w:type="dxa"/>
+            <w:vAlign w:val="center"/>
           </w:tcPr>
           <w:p>
             <w:pPr>
               <w:spacing w:before="0" w:after="0" w:line="240" w:lineRule="auto"/>
+              <w:jc w:val="center"/>
             </w:pPr>
             <w:r>
               <w:rPr>
@@ -558,10 +574,12 @@
         <w:tc>
           <w:tcPr>
             <w:tcW w:w="964" w:type="dxa"/>
+            <w:vAlign w:val="center"/>
           </w:tcPr>
           <w:p>
             <w:pPr>
               <w:spacing w:before="0" w:after="0" w:line="240" w:lineRule="auto"/>
+              <w:jc w:val="center"/>
             </w:pPr>
             <w:r>
               <w:rPr>
@@ -576,10 +594,12 @@
         <w:tc>
           <w:tcPr>
             <w:tcW w:w="868" w:type="dxa"/>
+            <w:vAlign w:val="center"/>
           </w:tcPr>
           <w:p>
             <w:pPr>
               <w:spacing w:before="0" w:after="0" w:line="240" w:lineRule="auto"/>
+              <w:jc w:val="center"/>
             </w:pPr>
             <w:r>
               <w:rPr>
@@ -594,10 +614,12 @@
         <w:tc>
           <w:tcPr>
             <w:tcW w:w="981" w:type="dxa"/>
+            <w:vAlign w:val="center"/>
           </w:tcPr>
           <w:p>
             <w:pPr>
               <w:spacing w:before="0" w:after="0" w:line="240" w:lineRule="auto"/>
+              <w:jc w:val="center"/>
             </w:pPr>
             <w:bookmarkStart w:id="0" w:name="_GoBack"/>
             <w:bookmarkEnd w:id="0"/>

</xml_diff>

<commit_message>
Restore old TTN layout and fit cargo table
</commit_message>
<xml_diff>
--- a/assets/Шаблон_ТТН_демо.docx
+++ b/assets/Шаблон_ТТН_демо.docx
@@ -2,23 +2,125 @@
 <file path=word/document.xml><?xml version="1.0" encoding="utf-8"?>
 <w:document xmlns:wpc="http://schemas.microsoft.com/office/word/2010/wordprocessingCanvas" xmlns:cx="http://schemas.microsoft.com/office/drawing/2014/chartex" xmlns:mc="http://schemas.openxmlformats.org/markup-compatibility/2006" xmlns:o="urn:schemas-microsoft-com:office:office" xmlns:r="http://schemas.openxmlformats.org/officeDocument/2006/relationships" xmlns:m="http://schemas.openxmlformats.org/officeDocument/2006/math" xmlns:v="urn:schemas-microsoft-com:vml" xmlns:wp14="http://schemas.microsoft.com/office/word/2010/wordprocessingDrawing" xmlns:wp="http://schemas.openxmlformats.org/drawingml/2006/wordprocessingDrawing" xmlns:w10="urn:schemas-microsoft-com:office:word" xmlns:w="http://schemas.openxmlformats.org/wordprocessingml/2006/main" xmlns:w14="http://schemas.microsoft.com/office/word/2010/wordml" xmlns:w15="http://schemas.microsoft.com/office/word/2012/wordml" xmlns:w16se="http://schemas.microsoft.com/office/word/2015/wordml/symex" xmlns:wpg="http://schemas.microsoft.com/office/word/2010/wordprocessingGroup" xmlns:wpi="http://schemas.microsoft.com/office/word/2010/wordprocessingInk" xmlns:wne="http://schemas.microsoft.com/office/word/2006/wordml" xmlns:wps="http://schemas.microsoft.com/office/word/2010/wordprocessingShape" mc:Ignorable="w14 w15 w16se wp14">
   <w:body>
+    <w:tbl>
+      <w:tblPr>
+        <w:tblStyle w:val="a5"/>
+        <w:tblW w:w="0" w:type="auto"/>
+        <w:tblInd w:w="4219" w:type="dxa"/>
+        <w:tblBorders>
+          <w:top w:val="none" w:sz="0" w:space="0" w:color="auto"/>
+          <w:left w:val="none" w:sz="0" w:space="0" w:color="auto"/>
+          <w:bottom w:val="none" w:sz="0" w:space="0" w:color="auto"/>
+          <w:right w:val="none" w:sz="0" w:space="0" w:color="auto"/>
+          <w:insideH w:val="none" w:sz="0" w:space="0" w:color="auto"/>
+          <w:insideV w:val="none" w:sz="0" w:space="0" w:color="auto"/>
+        </w:tblBorders>
+        <w:tblLook w:val="04A0" w:firstRow="1" w:lastRow="0" w:firstColumn="1" w:lastColumn="0" w:noHBand="0" w:noVBand="1"/>
+      </w:tblPr>
+      <w:tblGrid>
+        <w:gridCol w:w="2381"/>
+        <w:gridCol w:w="2381"/>
+        <w:gridCol w:w="2381"/>
+      </w:tblGrid>
+      <w:tr>
+        <w:trPr>
+          <w:trHeight w:hRule="exact" w:val="340"/>
+        </w:trPr>
+        <w:tc>
+          <w:tcPr>
+            <w:tcW w:w="2381" w:type="dxa"/>
+          </w:tcPr>
+          <w:p>
+            <w:pPr>
+              <w:spacing w:after="0" w:line="240" w:lineRule="auto"/>
+              <w:jc w:val="center"/>
+              <w:rPr>
+                <w:rFonts w:ascii="Times New Roman" w:hAnsi="Times New Roman" w:cs="Times New Roman"/>
+                <w:szCs w:val="24"/>
+                <w:lang w:val="en-US"/>
+              </w:rPr>
+            </w:pPr>
+            <w:r>
+              <w:rPr>
+                <w:rFonts w:ascii="Times New Roman" w:hAnsi="Times New Roman" w:cs="Times New Roman"/>
+                <w:szCs w:val="24"/>
+                <w:lang w:val="en-US"/>
+              </w:rPr>
+              <w:t>{{shipper_unp}}</w:t>
+            </w:r>
+          </w:p>
+        </w:tc>
+        <w:tc>
+          <w:tcPr>
+            <w:tcW w:w="2381" w:type="dxa"/>
+          </w:tcPr>
+          <w:p>
+            <w:pPr>
+              <w:spacing w:after="0" w:line="240" w:lineRule="auto"/>
+              <w:jc w:val="center"/>
+              <w:rPr>
+                <w:rFonts w:ascii="Times New Roman" w:hAnsi="Times New Roman" w:cs="Times New Roman"/>
+                <w:szCs w:val="24"/>
+                <w:lang w:val="en-US"/>
+              </w:rPr>
+            </w:pPr>
+            <w:r>
+              <w:rPr>
+                <w:rFonts w:ascii="Times New Roman" w:hAnsi="Times New Roman" w:cs="Times New Roman"/>
+                <w:szCs w:val="24"/>
+                <w:lang w:val="en-US"/>
+              </w:rPr>
+              <w:t>{{consignee_unp}}</w:t>
+            </w:r>
+          </w:p>
+        </w:tc>
+        <w:tc>
+          <w:tcPr>
+            <w:tcW w:w="2381" w:type="dxa"/>
+          </w:tcPr>
+          <w:p>
+            <w:pPr>
+              <w:spacing w:after="0" w:line="240" w:lineRule="auto"/>
+              <w:jc w:val="center"/>
+              <w:rPr>
+                <w:rFonts w:ascii="Times New Roman" w:hAnsi="Times New Roman" w:cs="Times New Roman"/>
+                <w:szCs w:val="24"/>
+              </w:rPr>
+            </w:pPr>
+            <w:r>
+              <w:rPr>
+                <w:rFonts w:ascii="Times New Roman" w:hAnsi="Times New Roman" w:cs="Times New Roman"/>
+                <w:szCs w:val="24"/>
+                <w:lang w:val="en-US"/>
+              </w:rPr>
+              <w:t>{{customer_unp}}</w:t>
+            </w:r>
+          </w:p>
+        </w:tc>
+      </w:tr>
+    </w:tbl>
     <w:p>
       <w:pPr>
-        <w:spacing w:before="0" w:after="0" w:line="643" w:lineRule="exact"/>
+        <w:spacing w:before="240"/>
+        <w:rPr>
+          <w:rFonts w:ascii="Times New Roman" w:hAnsi="Times New Roman" w:cs="Times New Roman"/>
+          <w:szCs w:val="24"/>
+          <w:lang w:val="en-US"/>
+        </w:rPr>
       </w:pPr>
       <w:r>
         <w:rPr>
-          <w:rFonts w:ascii="Times New Roman" w:hAnsi="Times New Roman" w:cs="Times New Roman" w:eastAsia="Times New Roman"/>
-          <w:b w:val="0"/>
-          <w:sz w:val="2"/>
+          <w:rFonts w:ascii="Times New Roman" w:hAnsi="Times New Roman" w:cs="Times New Roman"/>
+          <w:szCs w:val="24"/>
+          <w:lang w:val="en-US"/>
         </w:rPr>
+        <w:tab/>
       </w:r>
     </w:p>
     <w:tbl>
       <w:tblPr>
         <w:tblStyle w:val="a5"/>
-        <w:tblW w:w="4242" w:type="dxa"/>
-        <w:tblInd w:w="5501" w:type="dxa"/>
+        <w:tblW w:w="0" w:type="auto"/>
         <w:tblBorders>
           <w:top w:val="none" w:sz="0" w:space="0" w:color="auto"/>
           <w:left w:val="none" w:sz="0" w:space="0" w:color="auto"/>
@@ -31,91 +133,490 @@
         <w:tblLook w:val="04A0" w:firstRow="1" w:lastRow="0" w:firstColumn="1" w:lastColumn="0" w:noHBand="0" w:noVBand="1"/>
       </w:tblPr>
       <w:tblGrid>
-        <w:gridCol w:w="1253"/>
-        <w:gridCol w:w="1255"/>
-        <w:gridCol w:w="1734"/>
+        <w:gridCol w:w="4567"/>
+        <w:gridCol w:w="1458"/>
+        <w:gridCol w:w="1600"/>
+        <w:gridCol w:w="1423"/>
+        <w:gridCol w:w="1559"/>
+        <w:gridCol w:w="4521"/>
       </w:tblGrid>
       <w:tr>
         <w:trPr>
-          <w:trHeight w:val="307" w:hRule="exact"/>
+          <w:gridBefore w:val="1"/>
+          <w:gridAfter w:val="2"/>
+          <w:wBefore w:w="4567" w:type="dxa"/>
+          <w:wAfter w:w="6080" w:type="dxa"/>
+          <w:trHeight w:hRule="exact" w:val="397"/>
         </w:trPr>
         <w:tc>
           <w:tcPr>
-            <w:tcW w:w="1253" w:type="dxa"/>
+            <w:tcW w:w="1458" w:type="dxa"/>
             <w:vAlign w:val="center"/>
           </w:tcPr>
           <w:p>
             <w:pPr>
-              <w:spacing w:after="0" w:line="240" w:lineRule="auto" w:before="0"/>
+              <w:spacing w:after="0" w:line="240" w:lineRule="auto"/>
+              <w:ind w:firstLineChars="150" w:firstLine="360"/>
+              <w:jc w:val="both"/>
+              <w:rPr>
+                <w:rFonts w:ascii="Times New Roman" w:hAnsi="Times New Roman" w:cs="Times New Roman"/>
+                <w:sz w:val="24"/>
+                <w:szCs w:val="24"/>
+                <w:lang w:val="en-US"/>
+              </w:rPr>
+            </w:pPr>
+            <w:r>
+              <w:rPr>
+                <w:rFonts w:ascii="Times New Roman" w:hAnsi="Times New Roman" w:cs="Times New Roman"/>
+                <w:sz w:val="24"/>
+                <w:szCs w:val="24"/>
+                <w:lang w:val="en-US"/>
+              </w:rPr>
+              <w:t>{{day}}</w:t>
+            </w:r>
+          </w:p>
+        </w:tc>
+        <w:tc>
+          <w:tcPr>
+            <w:tcW w:w="1600" w:type="dxa"/>
+            <w:vAlign w:val="center"/>
+          </w:tcPr>
+          <w:p>
+            <w:pPr>
+              <w:spacing w:after="0" w:line="240" w:lineRule="auto"/>
               <w:jc w:val="center"/>
               <w:rPr>
                 <w:rFonts w:ascii="Times New Roman" w:hAnsi="Times New Roman" w:cs="Times New Roman"/>
-                <w:szCs w:val="24"/>
-                <w:lang w:val="en-US"/>
-              </w:rPr>
-            </w:pPr>
-            <w:r>
-              <w:rPr>
-                <w:rFonts w:ascii="Times New Roman" w:hAnsi="Times New Roman" w:cs="Times New Roman" w:eastAsia="Times New Roman"/>
-                <w:b w:val="0"/>
-                <w:sz w:val="18"/>
-                <w:szCs w:val="24"/>
-                <w:lang w:val="en-US"/>
-              </w:rPr>
-              <w:t>{{shipper_unp}}</w:t>
-            </w:r>
-          </w:p>
-        </w:tc>
-        <w:tc>
-          <w:tcPr>
-            <w:tcW w:w="1255" w:type="dxa"/>
+                <w:sz w:val="24"/>
+                <w:szCs w:val="24"/>
+                <w:lang w:val="en-US"/>
+              </w:rPr>
+            </w:pPr>
+            <w:r>
+              <w:rPr>
+                <w:rFonts w:ascii="Times New Roman" w:hAnsi="Times New Roman" w:cs="Times New Roman"/>
+                <w:sz w:val="24"/>
+                <w:szCs w:val="24"/>
+                <w:lang w:val="en-US"/>
+              </w:rPr>
+              <w:t>{{month}}</w:t>
+            </w:r>
+          </w:p>
+        </w:tc>
+        <w:tc>
+          <w:tcPr>
+            <w:tcW w:w="1423" w:type="dxa"/>
             <w:vAlign w:val="center"/>
           </w:tcPr>
           <w:p>
             <w:pPr>
-              <w:spacing w:after="0" w:line="240" w:lineRule="auto" w:before="0"/>
+              <w:spacing w:after="0" w:line="240" w:lineRule="auto"/>
+              <w:jc w:val="both"/>
+              <w:rPr>
+                <w:rFonts w:ascii="Times New Roman" w:hAnsi="Times New Roman" w:cs="Times New Roman"/>
+                <w:sz w:val="24"/>
+                <w:szCs w:val="24"/>
+                <w:lang w:val="en-US"/>
+              </w:rPr>
+            </w:pPr>
+            <w:r>
+              <w:rPr>
+                <w:rFonts w:ascii="Times New Roman" w:hAnsi="Times New Roman" w:cs="Times New Roman"/>
+                <w:sz w:val="24"/>
+                <w:szCs w:val="24"/>
+                <w:lang w:val="en-US"/>
+              </w:rPr>
+              <w:t xml:space="preserve"> </w:t>
+            </w:r>
+            <w:r>
+              <w:rPr>
+                <w:rFonts w:ascii="Times New Roman" w:hAnsi="Times New Roman" w:cs="Times New Roman"/>
+                <w:sz w:val="24"/>
+                <w:szCs w:val="24"/>
+              </w:rPr>
+              <w:t xml:space="preserve">   </w:t>
+            </w:r>
+            <w:r>
+              <w:rPr>
+                <w:rFonts w:ascii="Times New Roman" w:hAnsi="Times New Roman" w:cs="Times New Roman"/>
+                <w:sz w:val="24"/>
+                <w:szCs w:val="24"/>
+                <w:lang w:val="en-US"/>
+              </w:rPr>
+              <w:t>{{year}}</w:t>
+            </w:r>
+          </w:p>
+        </w:tc>
+      </w:tr>
+      <w:tr>
+        <w:trPr>
+          <w:trHeight w:hRule="exact" w:val="170"/>
+        </w:trPr>
+        <w:tc>
+          <w:tcPr>
+            <w:tcW w:w="15128" w:type="dxa"/>
+            <w:gridSpan w:val="6"/>
+          </w:tcPr>
+          <w:p>
+            <w:pPr>
+              <w:spacing w:after="0" w:line="240" w:lineRule="auto"/>
+              <w:ind w:left="3005"/>
+              <w:rPr>
+                <w:rFonts w:ascii="Times New Roman" w:hAnsi="Times New Roman" w:cs="Times New Roman"/>
+                <w:sz w:val="24"/>
+                <w:szCs w:val="24"/>
+              </w:rPr>
+            </w:pPr>
+          </w:p>
+        </w:tc>
+      </w:tr>
+      <w:tr>
+        <w:trPr>
+          <w:trHeight w:hRule="exact" w:val="369"/>
+        </w:trPr>
+        <w:tc>
+          <w:tcPr>
+            <w:tcW w:w="6025" w:type="dxa"/>
+            <w:gridSpan w:val="2"/>
+          </w:tcPr>
+          <w:p>
+            <w:pPr>
+              <w:spacing w:after="0" w:line="240" w:lineRule="auto"/>
+              <w:ind w:firstLine="1276"/>
+              <w:rPr>
+                <w:rFonts w:ascii="Times New Roman" w:hAnsi="Times New Roman" w:cs="Times New Roman"/>
+                <w:sz w:val="24"/>
+                <w:szCs w:val="24"/>
+                <w:lang w:val="en-US"/>
+              </w:rPr>
+            </w:pPr>
+            <w:r>
+              <w:rPr>
+                <w:rFonts w:ascii="Times New Roman" w:hAnsi="Times New Roman" w:cs="Times New Roman"/>
+                <w:sz w:val="24"/>
+                <w:szCs w:val="24"/>
+              </w:rPr>
+              <w:t xml:space="preserve">  </w:t>
+            </w:r>
+            <w:r>
+              <w:rPr>
+                <w:rFonts w:ascii="Times New Roman" w:hAnsi="Times New Roman" w:cs="Times New Roman"/>
+                <w:sz w:val="24"/>
+                <w:szCs w:val="24"/>
+                <w:lang w:val="en-US"/>
+              </w:rPr>
+              <w:t>{{car_model}}</w:t>
+            </w:r>
+            <w:r>
+              <w:rPr>
+                <w:rFonts w:ascii="Times New Roman" w:hAnsi="Times New Roman" w:cs="Times New Roman"/>
+                <w:color w:val="C00000"/>
+                <w:sz w:val="24"/>
+                <w:szCs w:val="24"/>
+                <w:lang w:val="en-US"/>
+              </w:rPr>
+              <w:t xml:space="preserve"> </w:t>
+            </w:r>
+            <w:r>
+              <w:rPr>
+                <w:rFonts w:ascii="Times New Roman" w:hAnsi="Times New Roman" w:cs="Times New Roman"/>
+                <w:sz w:val="24"/>
+                <w:szCs w:val="24"/>
+                <w:lang w:val="en-US"/>
+              </w:rPr>
+              <w:t>{{car_plate}}</w:t>
+            </w:r>
+          </w:p>
+        </w:tc>
+        <w:tc>
+          <w:tcPr>
+            <w:tcW w:w="4582" w:type="dxa"/>
+            <w:gridSpan w:val="3"/>
+          </w:tcPr>
+          <w:p>
+            <w:pPr>
+              <w:spacing w:after="0" w:line="240" w:lineRule="auto"/>
+              <w:ind w:firstLineChars="550" w:firstLine="1320"/>
+              <w:jc w:val="both"/>
+              <w:rPr>
+                <w:rFonts w:ascii="Times New Roman" w:hAnsi="Times New Roman" w:cs="Times New Roman"/>
+                <w:sz w:val="24"/>
+                <w:szCs w:val="24"/>
+                <w:lang w:val="en-US"/>
+              </w:rPr>
+            </w:pPr>
+            <w:r>
+              <w:rPr>
+                <w:rFonts w:ascii="Times New Roman" w:hAnsi="Times New Roman" w:cs="Times New Roman"/>
+                <w:sz w:val="24"/>
+                <w:szCs w:val="24"/>
+                <w:lang w:val="en-US"/>
+              </w:rPr>
+              <w:t>{{trailer_info}}</w:t>
+            </w:r>
+          </w:p>
+        </w:tc>
+        <w:tc>
+          <w:tcPr>
+            <w:tcW w:w="4521" w:type="dxa"/>
+          </w:tcPr>
+          <w:p>
+            <w:pPr>
+              <w:spacing w:after="0" w:line="240" w:lineRule="auto"/>
+              <w:ind w:left="708"/>
               <w:jc w:val="center"/>
               <w:rPr>
                 <w:rFonts w:ascii="Times New Roman" w:hAnsi="Times New Roman" w:cs="Times New Roman"/>
-                <w:szCs w:val="24"/>
-                <w:lang w:val="en-US"/>
-              </w:rPr>
-            </w:pPr>
-            <w:r>
-              <w:rPr>
-                <w:rFonts w:ascii="Times New Roman" w:hAnsi="Times New Roman" w:cs="Times New Roman" w:eastAsia="Times New Roman"/>
-                <w:b w:val="0"/>
-                <w:sz w:val="18"/>
-                <w:szCs w:val="24"/>
-                <w:lang w:val="en-US"/>
-              </w:rPr>
-              <w:t>{{consignee_unp}}</w:t>
-            </w:r>
-          </w:p>
-        </w:tc>
-        <w:tc>
-          <w:tcPr>
-            <w:tcW w:w="1734" w:type="dxa"/>
-            <w:vAlign w:val="center"/>
-          </w:tcPr>
-          <w:p>
-            <w:pPr>
-              <w:spacing w:after="0" w:line="240" w:lineRule="auto" w:before="0"/>
+                <w:sz w:val="24"/>
+                <w:szCs w:val="24"/>
+                <w:lang w:val="en-US"/>
+              </w:rPr>
+            </w:pPr>
+            <w:r>
+              <w:rPr>
+                <w:rFonts w:ascii="Times New Roman" w:hAnsi="Times New Roman" w:cs="Times New Roman"/>
+                <w:sz w:val="24"/>
+                <w:szCs w:val="24"/>
+                <w:lang w:val="en-US"/>
+              </w:rPr>
+              <w:t>{{waybill_number}}</w:t>
+            </w:r>
+          </w:p>
+        </w:tc>
+      </w:tr>
+      <w:tr>
+        <w:trPr>
+          <w:trHeight w:hRule="exact" w:val="369"/>
+        </w:trPr>
+        <w:tc>
+          <w:tcPr>
+            <w:tcW w:w="7625" w:type="dxa"/>
+            <w:gridSpan w:val="3"/>
+          </w:tcPr>
+          <w:p>
+            <w:pPr>
+              <w:spacing w:after="0" w:line="240" w:lineRule="auto"/>
+              <w:ind w:left="1985"/>
+              <w:rPr>
+                <w:rFonts w:ascii="Times New Roman" w:hAnsi="Times New Roman" w:cs="Times New Roman"/>
+                <w:sz w:val="24"/>
+                <w:szCs w:val="24"/>
+                <w:lang w:val="en-US"/>
+              </w:rPr>
+            </w:pPr>
+            <w:r>
+              <w:rPr>
+                <w:rFonts w:ascii="Times New Roman" w:hAnsi="Times New Roman" w:cs="Times New Roman"/>
+                <w:sz w:val="24"/>
+                <w:szCs w:val="24"/>
+                <w:lang w:val="en-US"/>
+              </w:rPr>
+              <w:t>{{driver_name}}</w:t>
+            </w:r>
+          </w:p>
+        </w:tc>
+        <w:tc>
+          <w:tcPr>
+            <w:tcW w:w="7503" w:type="dxa"/>
+            <w:gridSpan w:val="3"/>
+          </w:tcPr>
+          <w:p>
+            <w:pPr>
+              <w:spacing w:after="0" w:line="240" w:lineRule="auto"/>
+              <w:ind w:left="4203"/>
+              <w:rPr>
+                <w:rFonts w:ascii="Times New Roman" w:hAnsi="Times New Roman" w:cs="Times New Roman"/>
+                <w:sz w:val="24"/>
+                <w:szCs w:val="24"/>
+              </w:rPr>
+            </w:pPr>
+          </w:p>
+        </w:tc>
+      </w:tr>
+      <w:tr>
+        <w:trPr>
+          <w:trHeight w:hRule="exact" w:val="369"/>
+        </w:trPr>
+        <w:tc>
+          <w:tcPr>
+            <w:tcW w:w="15128" w:type="dxa"/>
+            <w:gridSpan w:val="6"/>
+          </w:tcPr>
+          <w:p>
+            <w:pPr>
+              <w:spacing w:after="0" w:line="240" w:lineRule="auto"/>
+              <w:ind w:left="4248"/>
+              <w:rPr>
+                <w:rFonts w:ascii="Times New Roman" w:hAnsi="Times New Roman" w:cs="Times New Roman"/>
+                <w:sz w:val="24"/>
+                <w:szCs w:val="24"/>
+                <w:lang w:val="en-US"/>
+              </w:rPr>
+            </w:pPr>
+            <w:r>
+              <w:rPr>
+                <w:rFonts w:ascii="Times New Roman" w:hAnsi="Times New Roman" w:cs="Times New Roman"/>
+                <w:sz w:val="24"/>
+                <w:szCs w:val="24"/>
+                <w:lang w:val="en-US"/>
+              </w:rPr>
+              <w:t>{{customer}}</w:t>
+            </w:r>
+          </w:p>
+        </w:tc>
+      </w:tr>
+      <w:tr>
+        <w:trPr>
+          <w:trHeight w:hRule="exact" w:val="369"/>
+        </w:trPr>
+        <w:tc>
+          <w:tcPr>
+            <w:tcW w:w="15128" w:type="dxa"/>
+            <w:gridSpan w:val="6"/>
+          </w:tcPr>
+          <w:p>
+            <w:pPr>
+              <w:spacing w:after="0" w:line="240" w:lineRule="auto"/>
+              <w:ind w:left="1985"/>
+              <w:rPr>
+                <w:rFonts w:ascii="Times New Roman" w:hAnsi="Times New Roman" w:cs="Times New Roman"/>
+                <w:sz w:val="24"/>
+                <w:szCs w:val="24"/>
+                <w:lang w:val="en-US"/>
+              </w:rPr>
+            </w:pPr>
+            <w:r>
+              <w:rPr>
+                <w:rFonts w:ascii="Times New Roman" w:hAnsi="Times New Roman" w:cs="Times New Roman"/>
+                <w:sz w:val="24"/>
+                <w:szCs w:val="24"/>
+                <w:lang w:val="en-US"/>
+              </w:rPr>
+              <w:t>{{shipper}}</w:t>
+            </w:r>
+          </w:p>
+        </w:tc>
+      </w:tr>
+      <w:tr>
+        <w:trPr>
+          <w:trHeight w:hRule="exact" w:val="369"/>
+        </w:trPr>
+        <w:tc>
+          <w:tcPr>
+            <w:tcW w:w="15128" w:type="dxa"/>
+            <w:gridSpan w:val="6"/>
+          </w:tcPr>
+          <w:p>
+            <w:pPr>
+              <w:spacing w:after="0" w:line="240" w:lineRule="auto"/>
+              <w:ind w:left="2124"/>
+              <w:rPr>
+                <w:rFonts w:ascii="Times New Roman" w:hAnsi="Times New Roman" w:cs="Times New Roman"/>
+                <w:sz w:val="24"/>
+                <w:szCs w:val="24"/>
+                <w:lang w:val="en-US"/>
+              </w:rPr>
+            </w:pPr>
+            <w:r>
+              <w:rPr>
+                <w:rFonts w:ascii="Times New Roman" w:hAnsi="Times New Roman" w:cs="Times New Roman"/>
+                <w:sz w:val="24"/>
+                <w:szCs w:val="24"/>
+                <w:lang w:val="en-US"/>
+              </w:rPr>
+              <w:t>{{consignee}}</w:t>
+            </w:r>
+          </w:p>
+        </w:tc>
+      </w:tr>
+      <w:tr>
+        <w:trPr>
+          <w:trHeight w:hRule="exact" w:val="369"/>
+        </w:trPr>
+        <w:tc>
+          <w:tcPr>
+            <w:tcW w:w="6025" w:type="dxa"/>
+            <w:gridSpan w:val="2"/>
+          </w:tcPr>
+          <w:p>
+            <w:pPr>
+              <w:spacing w:after="0" w:line="240" w:lineRule="auto"/>
+              <w:ind w:left="1701"/>
+              <w:jc w:val="both"/>
+              <w:rPr>
+                <w:rFonts w:ascii="Times New Roman" w:hAnsi="Times New Roman" w:cs="Times New Roman"/>
+                <w:sz w:val="24"/>
+                <w:szCs w:val="24"/>
+                <w:lang w:val="en-US"/>
+              </w:rPr>
+            </w:pPr>
+            <w:r>
+              <w:rPr>
+                <w:rFonts w:ascii="Times New Roman" w:hAnsi="Times New Roman" w:cs="Times New Roman"/>
+                <w:sz w:val="24"/>
+                <w:szCs w:val="24"/>
+                <w:lang w:val="en-US"/>
+              </w:rPr>
+              <w:t>{{release_basis}}</w:t>
+            </w:r>
+          </w:p>
+        </w:tc>
+        <w:tc>
+          <w:tcPr>
+            <w:tcW w:w="9103" w:type="dxa"/>
+            <w:gridSpan w:val="4"/>
+          </w:tcPr>
+          <w:p>
+            <w:pPr>
+              <w:spacing w:after="0" w:line="240" w:lineRule="auto"/>
+              <w:ind w:left="2124"/>
               <w:jc w:val="center"/>
               <w:rPr>
                 <w:rFonts w:ascii="Times New Roman" w:hAnsi="Times New Roman" w:cs="Times New Roman"/>
-                <w:szCs w:val="24"/>
-              </w:rPr>
-            </w:pPr>
-            <w:r>
-              <w:rPr>
-                <w:rFonts w:ascii="Times New Roman" w:hAnsi="Times New Roman" w:cs="Times New Roman" w:eastAsia="Times New Roman"/>
-                <w:b w:val="0"/>
-                <w:sz w:val="18"/>
-                <w:szCs w:val="24"/>
-                <w:lang w:val="en-US"/>
-              </w:rPr>
-              <w:t>{{customer_unp}}</w:t>
+                <w:sz w:val="24"/>
+                <w:szCs w:val="24"/>
+                <w:lang w:val="en-US"/>
+              </w:rPr>
+            </w:pPr>
+            <w:r>
+              <w:rPr>
+                <w:rFonts w:ascii="Times New Roman" w:hAnsi="Times New Roman" w:cs="Times New Roman"/>
+                <w:sz w:val="24"/>
+                <w:szCs w:val="24"/>
+                <w:lang w:val="en-US"/>
+              </w:rPr>
+              <w:t>{{loading_point}}</w:t>
+            </w:r>
+          </w:p>
+        </w:tc>
+      </w:tr>
+      <w:tr>
+        <w:trPr>
+          <w:trHeight w:hRule="exact" w:val="369"/>
+        </w:trPr>
+        <w:tc>
+          <w:tcPr>
+            <w:tcW w:w="15128" w:type="dxa"/>
+            <w:gridSpan w:val="6"/>
+          </w:tcPr>
+          <w:p>
+            <w:pPr>
+              <w:spacing w:after="0" w:line="240" w:lineRule="auto"/>
+              <w:ind w:firstLineChars="700" w:firstLine="1680"/>
+              <w:rPr>
+                <w:rFonts w:ascii="Times New Roman" w:hAnsi="Times New Roman" w:cs="Times New Roman"/>
+                <w:sz w:val="24"/>
+                <w:szCs w:val="24"/>
+              </w:rPr>
+            </w:pPr>
+            <w:r>
+              <w:rPr>
+                <w:rFonts w:ascii="Times New Roman" w:hAnsi="Times New Roman" w:cs="Times New Roman"/>
+                <w:sz w:val="24"/>
+                <w:szCs w:val="24"/>
+                <w:lang w:val="en-US"/>
+              </w:rPr>
+              <w:t>{{unloading_point}}</w:t>
             </w:r>
           </w:p>
         </w:tc>
@@ -123,260 +624,35 @@
     </w:tbl>
     <w:p>
       <w:pPr>
-        <w:keepLines/>
-        <w:tabs>
-          <w:tab w:pos="5037" w:val="left"/>
-          <w:tab w:pos="6425" w:val="left"/>
-          <w:tab w:pos="7735" w:val="left"/>
-        </w:tabs>
-        <w:spacing w:before="191" w:after="0" w:line="264" w:lineRule="exact"/>
-        <w:ind w:left="0" w:firstLine="0"/>
+        <w:rPr>
+          <w:rFonts w:ascii="Times New Roman" w:hAnsi="Times New Roman" w:cs="Times New Roman"/>
+          <w:sz w:val="24"/>
+          <w:szCs w:val="24"/>
+        </w:rPr>
       </w:pPr>
-      <w:r>
-        <w:rPr>
-          <w:rFonts w:ascii="Times New Roman" w:hAnsi="Times New Roman" w:cs="Times New Roman" w:eastAsia="Times New Roman"/>
-          <w:b w:val="0"/>
-          <w:sz w:val="24"/>
-        </w:rPr>
-        <w:tab/>
-      </w:r>
-      <w:r>
-        <w:rPr>
-          <w:rFonts w:ascii="Times New Roman" w:hAnsi="Times New Roman" w:cs="Times New Roman" w:eastAsia="Times New Roman"/>
-          <w:b w:val="0"/>
-          <w:sz w:val="24"/>
-        </w:rPr>
-        <w:t>{{day}}</w:t>
-      </w:r>
-      <w:r>
-        <w:rPr>
-          <w:rFonts w:ascii="Times New Roman" w:hAnsi="Times New Roman" w:cs="Times New Roman" w:eastAsia="Times New Roman"/>
-          <w:b w:val="0"/>
-          <w:sz w:val="24"/>
-        </w:rPr>
-        <w:tab/>
-      </w:r>
-      <w:r>
-        <w:rPr>
-          <w:rFonts w:ascii="Times New Roman" w:hAnsi="Times New Roman" w:cs="Times New Roman" w:eastAsia="Times New Roman"/>
-          <w:b w:val="0"/>
-          <w:sz w:val="24"/>
-        </w:rPr>
-        <w:t>{{month}}</w:t>
-      </w:r>
-      <w:r>
-        <w:rPr>
-          <w:rFonts w:ascii="Times New Roman" w:hAnsi="Times New Roman" w:cs="Times New Roman" w:eastAsia="Times New Roman"/>
-          <w:b w:val="0"/>
-          <w:sz w:val="24"/>
-        </w:rPr>
-        <w:tab/>
-      </w:r>
-      <w:r>
-        <w:rPr>
-          <w:rFonts w:ascii="Times New Roman" w:hAnsi="Times New Roman" w:cs="Times New Roman" w:eastAsia="Times New Roman"/>
-          <w:b w:val="0"/>
-          <w:sz w:val="24"/>
-        </w:rPr>
-        <w:t>{{year}}</w:t>
-      </w:r>
     </w:p>
     <w:p>
       <w:pPr>
-        <w:keepLines/>
-        <w:tabs>
-          <w:tab w:pos="1253" w:val="left"/>
-          <w:tab w:pos="9069" w:val="left"/>
-          <w:tab w:pos="14179" w:val="left"/>
-        </w:tabs>
-        <w:spacing w:before="1087" w:after="0" w:line="200" w:lineRule="exact"/>
-        <w:ind w:left="0" w:firstLine="0"/>
+        <w:rPr>
+          <w:rFonts w:ascii="Times New Roman" w:hAnsi="Times New Roman" w:cs="Times New Roman"/>
+          <w:sz w:val="24"/>
+          <w:szCs w:val="24"/>
+        </w:rPr>
       </w:pPr>
-      <w:r>
-        <w:rPr>
-          <w:rFonts w:ascii="Times New Roman" w:hAnsi="Times New Roman" w:cs="Times New Roman" w:eastAsia="Times New Roman"/>
-          <w:b w:val="0"/>
-          <w:sz w:val="19"/>
-        </w:rPr>
-        <w:tab/>
-      </w:r>
-      <w:r>
-        <w:rPr>
-          <w:rFonts w:ascii="Times New Roman" w:hAnsi="Times New Roman" w:cs="Times New Roman" w:eastAsia="Times New Roman"/>
-          <w:b w:val="0"/>
-          <w:sz w:val="19"/>
-        </w:rPr>
-        <w:t>{{car_model}} {{car_plate}}</w:t>
-      </w:r>
-      <w:r>
-        <w:rPr>
-          <w:rFonts w:ascii="Times New Roman" w:hAnsi="Times New Roman" w:cs="Times New Roman" w:eastAsia="Times New Roman"/>
-          <w:b w:val="0"/>
-          <w:sz w:val="19"/>
-        </w:rPr>
-        <w:tab/>
-      </w:r>
-      <w:r>
-        <w:rPr>
-          <w:rFonts w:ascii="Times New Roman" w:hAnsi="Times New Roman" w:cs="Times New Roman" w:eastAsia="Times New Roman"/>
-          <w:b w:val="0"/>
-          <w:sz w:val="19"/>
-        </w:rPr>
-        <w:t>{{trailer_info}}</w:t>
-      </w:r>
-      <w:r>
-        <w:rPr>
-          <w:rFonts w:ascii="Times New Roman" w:hAnsi="Times New Roman" w:cs="Times New Roman" w:eastAsia="Times New Roman"/>
-          <w:b w:val="0"/>
-          <w:sz w:val="19"/>
-        </w:rPr>
-        <w:tab/>
-      </w:r>
-      <w:r>
-        <w:rPr>
-          <w:rFonts w:ascii="Times New Roman" w:hAnsi="Times New Roman" w:cs="Times New Roman" w:eastAsia="Times New Roman"/>
-          <w:b w:val="0"/>
-          <w:sz w:val="19"/>
-        </w:rPr>
-        <w:t>{{waybill_number}}</w:t>
-      </w:r>
     </w:p>
     <w:p>
       <w:pPr>
-        <w:keepLines/>
-        <w:spacing w:before="297" w:after="0" w:line="200" w:lineRule="exact"/>
-        <w:ind w:left="964" w:firstLine="0"/>
+        <w:rPr>
+          <w:rFonts w:ascii="Times New Roman" w:hAnsi="Times New Roman" w:cs="Times New Roman"/>
+          <w:sz w:val="24"/>
+          <w:szCs w:val="24"/>
+        </w:rPr>
       </w:pPr>
-      <w:r>
-        <w:rPr>
-          <w:rFonts w:ascii="Times New Roman" w:hAnsi="Times New Roman" w:cs="Times New Roman" w:eastAsia="Times New Roman"/>
-          <w:b w:val="0"/>
-          <w:sz w:val="19"/>
-        </w:rPr>
-        <w:t>{{driver_name}}</w:t>
-      </w:r>
-    </w:p>
-    <w:p>
-      <w:pPr>
-        <w:keepLines/>
-        <w:spacing w:before="443" w:after="0" w:line="200" w:lineRule="exact"/>
-        <w:ind w:left="4180" w:firstLine="0"/>
-      </w:pPr>
-      <w:r>
-        <w:rPr>
-          <w:rFonts w:ascii="Times New Roman" w:hAnsi="Times New Roman" w:cs="Times New Roman" w:eastAsia="Times New Roman"/>
-          <w:b w:val="0"/>
-          <w:sz w:val="19"/>
-        </w:rPr>
-        <w:t>{{customer}}</w:t>
-      </w:r>
-    </w:p>
-    <w:p>
-      <w:pPr>
-        <w:keepLines/>
-        <w:spacing w:before="238" w:after="0" w:line="200" w:lineRule="exact"/>
-        <w:ind w:left="2109" w:firstLine="0"/>
-      </w:pPr>
-      <w:r>
-        <w:rPr>
-          <w:rFonts w:ascii="Times New Roman" w:hAnsi="Times New Roman" w:cs="Times New Roman" w:eastAsia="Times New Roman"/>
-          <w:b w:val="0"/>
-          <w:sz w:val="19"/>
-        </w:rPr>
-        <w:t>{{shipper}}</w:t>
-      </w:r>
-    </w:p>
-    <w:p>
-      <w:pPr>
-        <w:keepLines/>
-        <w:spacing w:before="254" w:after="0" w:line="200" w:lineRule="exact"/>
-        <w:ind w:left="2109" w:firstLine="0"/>
-      </w:pPr>
-      <w:r>
-        <w:rPr>
-          <w:rFonts w:ascii="Times New Roman" w:hAnsi="Times New Roman" w:cs="Times New Roman" w:eastAsia="Times New Roman"/>
-          <w:b w:val="0"/>
-          <w:sz w:val="19"/>
-        </w:rPr>
-        <w:t>{{consignee}}</w:t>
-      </w:r>
-    </w:p>
-    <w:p>
-      <w:pPr>
-        <w:keepLines/>
-        <w:tabs>
-          <w:tab w:pos="2014" w:val="left"/>
-          <w:tab w:pos="7912" w:val="left"/>
-          <w:tab w:pos="12251" w:val="left"/>
-        </w:tabs>
-        <w:spacing w:before="240" w:after="0" w:line="200" w:lineRule="exact"/>
-        <w:ind w:left="0" w:firstLine="0"/>
-      </w:pPr>
-      <w:r>
-        <w:rPr>
-          <w:rFonts w:ascii="Times New Roman" w:hAnsi="Times New Roman" w:cs="Times New Roman" w:eastAsia="Times New Roman"/>
-          <w:b w:val="0"/>
-          <w:sz w:val="19"/>
-        </w:rPr>
-        <w:tab/>
-      </w:r>
-      <w:r>
-        <w:rPr>
-          <w:rFonts w:ascii="Times New Roman" w:hAnsi="Times New Roman" w:cs="Times New Roman" w:eastAsia="Times New Roman"/>
-          <w:b w:val="0"/>
-          <w:sz w:val="19"/>
-        </w:rPr>
-        <w:t>{{release_basis}}</w:t>
-      </w:r>
-      <w:r>
-        <w:rPr>
-          <w:rFonts w:ascii="Times New Roman" w:hAnsi="Times New Roman" w:cs="Times New Roman" w:eastAsia="Times New Roman"/>
-          <w:b w:val="0"/>
-          <w:sz w:val="19"/>
-        </w:rPr>
-        <w:tab/>
-      </w:r>
-      <w:r>
-        <w:rPr>
-          <w:rFonts w:ascii="Times New Roman" w:hAnsi="Times New Roman" w:cs="Times New Roman" w:eastAsia="Times New Roman"/>
-          <w:b w:val="0"/>
-          <w:sz w:val="19"/>
-        </w:rPr>
-        <w:t>{{loading_point}}</w:t>
-      </w:r>
-      <w:r>
-        <w:rPr>
-          <w:rFonts w:ascii="Times New Roman" w:hAnsi="Times New Roman" w:cs="Times New Roman" w:eastAsia="Times New Roman"/>
-          <w:b w:val="0"/>
-          <w:sz w:val="19"/>
-        </w:rPr>
-        <w:tab/>
-      </w:r>
-      <w:r>
-        <w:rPr>
-          <w:rFonts w:ascii="Times New Roman" w:hAnsi="Times New Roman" w:cs="Times New Roman" w:eastAsia="Times New Roman"/>
-          <w:b w:val="0"/>
-          <w:sz w:val="19"/>
-        </w:rPr>
-        <w:t>{{unloading_point}}</w:t>
-      </w:r>
-    </w:p>
-    <w:p>
-      <w:pPr>
-        <w:spacing w:before="0" w:after="0" w:line="2148" w:lineRule="exact"/>
-      </w:pPr>
-      <w:r>
-        <w:rPr>
-          <w:rFonts w:ascii="Times New Roman" w:hAnsi="Times New Roman" w:cs="Times New Roman" w:eastAsia="Times New Roman"/>
-          <w:b w:val="0"/>
-          <w:sz w:val="2"/>
-        </w:rPr>
-      </w:r>
     </w:p>
     <w:tbl>
       <w:tblPr>
         <w:tblStyle w:val="a5"/>
-        <w:tblW w:w="14969" w:type="dxa"/>
+        <w:tblW w:w="14968" w:type="dxa"/>
         <w:tblInd w:w="0" w:type="dxa"/>
         <w:tblBorders>
           <w:top w:val="none" w:sz="0" w:space="0" w:color="auto"/>
@@ -396,7 +672,7 @@
         <w:gridCol w:w="1157"/>
         <w:gridCol w:w="1253"/>
         <w:gridCol w:w="1060"/>
-        <w:gridCol w:w="1062"/>
+        <w:gridCol w:w="1061"/>
         <w:gridCol w:w="1351"/>
         <w:gridCol w:w="964"/>
         <w:gridCol w:w="868"/>
@@ -406,27 +682,15 @@
         <w:tc>
           <w:tcPr>
             <w:tcW w:w="4344" w:type="dxa"/>
-            <w:vAlign w:val="center"/>
-          </w:tcPr>
-          <w:p>
-            <w:pPr>
-              <w:spacing w:before="0" w:after="0" w:line="240" w:lineRule="auto"/>
+          </w:tcPr>
+          <w:p>
+            <w:pPr>
               <w:jc w:val="left"/>
             </w:pPr>
             <w:r>
-              <w:rPr>
-                <w:rFonts w:ascii="Times New Roman" w:hAnsi="Times New Roman" w:cs="Times New Roman" w:eastAsia="Times New Roman"/>
-                <w:b w:val="0"/>
-                <w:sz w:val="18"/>
-              </w:rPr>
               <w:t>{</w:t>
             </w:r>
             <w:r>
-              <w:rPr>
-                <w:rFonts w:ascii="Times New Roman" w:hAnsi="Times New Roman" w:cs="Times New Roman" w:eastAsia="Times New Roman"/>
-                <w:b w:val="0"/>
-                <w:sz w:val="18"/>
-              </w:rPr>
               <w:t>{cargo.cargo_name}}</w:t>
             </w:r>
           </w:p>
@@ -434,19 +698,12 @@
         <w:tc>
           <w:tcPr>
             <w:tcW w:w="1157" w:type="dxa"/>
-            <w:vAlign w:val="center"/>
-          </w:tcPr>
-          <w:p>
-            <w:pPr>
-              <w:spacing w:before="0" w:after="0" w:line="240" w:lineRule="auto"/>
+          </w:tcPr>
+          <w:p>
+            <w:pPr>
               <w:jc w:val="center"/>
             </w:pPr>
             <w:r>
-              <w:rPr>
-                <w:rFonts w:ascii="Times New Roman" w:hAnsi="Times New Roman" w:cs="Times New Roman" w:eastAsia="Times New Roman"/>
-                <w:b w:val="0"/>
-                <w:sz w:val="18"/>
-              </w:rPr>
               <w:t>{{cargo.si}}</w:t>
             </w:r>
           </w:p>
@@ -454,19 +711,12 @@
         <w:tc>
           <w:tcPr>
             <w:tcW w:w="772" w:type="dxa"/>
-            <w:vAlign w:val="center"/>
-          </w:tcPr>
-          <w:p>
-            <w:pPr>
-              <w:spacing w:before="0" w:after="0" w:line="240" w:lineRule="auto"/>
+          </w:tcPr>
+          <w:p>
+            <w:pPr>
               <w:jc w:val="center"/>
             </w:pPr>
             <w:r>
-              <w:rPr>
-                <w:rFonts w:ascii="Times New Roman" w:hAnsi="Times New Roman" w:cs="Times New Roman" w:eastAsia="Times New Roman"/>
-                <w:b w:val="0"/>
-                <w:sz w:val="18"/>
-              </w:rPr>
               <w:t>{{cargo.unit}}</w:t>
             </w:r>
           </w:p>
@@ -474,19 +724,12 @@
         <w:tc>
           <w:tcPr>
             <w:tcW w:w="1157" w:type="dxa"/>
-            <w:vAlign w:val="center"/>
-          </w:tcPr>
-          <w:p>
-            <w:pPr>
-              <w:spacing w:before="0" w:after="0" w:line="240" w:lineRule="auto"/>
+          </w:tcPr>
+          <w:p>
+            <w:pPr>
               <w:jc w:val="center"/>
             </w:pPr>
             <w:r>
-              <w:rPr>
-                <w:rFonts w:ascii="Times New Roman" w:hAnsi="Times New Roman" w:cs="Times New Roman" w:eastAsia="Times New Roman"/>
-                <w:b w:val="0"/>
-                <w:sz w:val="18"/>
-              </w:rPr>
               <w:t>{{cargo.price}}</w:t>
             </w:r>
           </w:p>
@@ -494,19 +737,12 @@
         <w:tc>
           <w:tcPr>
             <w:tcW w:w="1253" w:type="dxa"/>
-            <w:vAlign w:val="center"/>
-          </w:tcPr>
-          <w:p>
-            <w:pPr>
-              <w:spacing w:before="0" w:after="0" w:line="240" w:lineRule="auto"/>
+          </w:tcPr>
+          <w:p>
+            <w:pPr>
               <w:jc w:val="center"/>
             </w:pPr>
             <w:r>
-              <w:rPr>
-                <w:rFonts w:ascii="Times New Roman" w:hAnsi="Times New Roman" w:cs="Times New Roman" w:eastAsia="Times New Roman"/>
-                <w:b w:val="0"/>
-                <w:sz w:val="18"/>
-              </w:rPr>
               <w:t>{{cargo.total_cost}}</w:t>
             </w:r>
           </w:p>
@@ -514,39 +750,25 @@
         <w:tc>
           <w:tcPr>
             <w:tcW w:w="1060" w:type="dxa"/>
-            <w:vAlign w:val="center"/>
-          </w:tcPr>
-          <w:p>
-            <w:pPr>
-              <w:spacing w:before="0" w:after="0" w:line="240" w:lineRule="auto"/>
+          </w:tcPr>
+          <w:p>
+            <w:pPr>
               <w:jc w:val="center"/>
             </w:pPr>
             <w:r>
-              <w:rPr>
-                <w:rFonts w:ascii="Times New Roman" w:hAnsi="Times New Roman" w:cs="Times New Roman" w:eastAsia="Times New Roman"/>
-                <w:b w:val="0"/>
-                <w:sz w:val="18"/>
-              </w:rPr>
               <w:t>{{cargo.vat_rate}}</w:t>
             </w:r>
           </w:p>
         </w:tc>
         <w:tc>
           <w:tcPr>
-            <w:tcW w:w="1062" w:type="dxa"/>
-            <w:vAlign w:val="center"/>
-          </w:tcPr>
-          <w:p>
-            <w:pPr>
-              <w:spacing w:before="0" w:after="0" w:line="240" w:lineRule="auto"/>
+            <w:tcW w:w="1061" w:type="dxa"/>
+          </w:tcPr>
+          <w:p>
+            <w:pPr>
               <w:jc w:val="center"/>
             </w:pPr>
             <w:r>
-              <w:rPr>
-                <w:rFonts w:ascii="Times New Roman" w:hAnsi="Times New Roman" w:cs="Times New Roman" w:eastAsia="Times New Roman"/>
-                <w:b w:val="0"/>
-                <w:sz w:val="18"/>
-              </w:rPr>
               <w:t>{{cargo.vat_cost}}</w:t>
             </w:r>
           </w:p>
@@ -554,19 +776,12 @@
         <w:tc>
           <w:tcPr>
             <w:tcW w:w="1351" w:type="dxa"/>
-            <w:vAlign w:val="center"/>
-          </w:tcPr>
-          <w:p>
-            <w:pPr>
-              <w:spacing w:before="0" w:after="0" w:line="240" w:lineRule="auto"/>
+          </w:tcPr>
+          <w:p>
+            <w:pPr>
               <w:jc w:val="center"/>
             </w:pPr>
             <w:r>
-              <w:rPr>
-                <w:rFonts w:ascii="Times New Roman" w:hAnsi="Times New Roman" w:cs="Times New Roman" w:eastAsia="Times New Roman"/>
-                <w:b w:val="0"/>
-                <w:sz w:val="18"/>
-              </w:rPr>
               <w:t>{{cargo.total_with_vat}}</w:t>
             </w:r>
           </w:p>
@@ -574,19 +789,12 @@
         <w:tc>
           <w:tcPr>
             <w:tcW w:w="964" w:type="dxa"/>
-            <w:vAlign w:val="center"/>
-          </w:tcPr>
-          <w:p>
-            <w:pPr>
-              <w:spacing w:before="0" w:after="0" w:line="240" w:lineRule="auto"/>
+          </w:tcPr>
+          <w:p>
+            <w:pPr>
               <w:jc w:val="center"/>
             </w:pPr>
             <w:r>
-              <w:rPr>
-                <w:rFonts w:ascii="Times New Roman" w:hAnsi="Times New Roman" w:cs="Times New Roman" w:eastAsia="Times New Roman"/>
-                <w:b w:val="0"/>
-                <w:sz w:val="18"/>
-              </w:rPr>
               <w:t>{{cargo.places}}</w:t>
             </w:r>
           </w:p>
@@ -594,19 +802,12 @@
         <w:tc>
           <w:tcPr>
             <w:tcW w:w="868" w:type="dxa"/>
-            <w:vAlign w:val="center"/>
-          </w:tcPr>
-          <w:p>
-            <w:pPr>
-              <w:spacing w:before="0" w:after="0" w:line="240" w:lineRule="auto"/>
+          </w:tcPr>
+          <w:p>
+            <w:pPr>
               <w:jc w:val="center"/>
             </w:pPr>
             <w:r>
-              <w:rPr>
-                <w:rFonts w:ascii="Times New Roman" w:hAnsi="Times New Roman" w:cs="Times New Roman" w:eastAsia="Times New Roman"/>
-                <w:b w:val="0"/>
-                <w:sz w:val="18"/>
-              </w:rPr>
               <w:t>{{cargo.cargo_qty}}</w:t>
             </w:r>
           </w:p>
@@ -614,11 +815,9 @@
         <w:tc>
           <w:tcPr>
             <w:tcW w:w="981" w:type="dxa"/>
-            <w:vAlign w:val="center"/>
-          </w:tcPr>
-          <w:p>
-            <w:pPr>
-              <w:spacing w:before="0" w:after="0" w:line="240" w:lineRule="auto"/>
+          </w:tcPr>
+          <w:p>
+            <w:pPr>
               <w:jc w:val="center"/>
             </w:pPr>
             <w:bookmarkStart w:id="0" w:name="_GoBack"/>

</xml_diff>

<commit_message>
Align TTN cargo row and second-page totals
</commit_message>
<xml_diff>
--- a/assets/Шаблон_ТТН_демо.docx
+++ b/assets/Шаблон_ТТН_демо.docx
@@ -642,6 +642,7 @@
     </w:p>
     <w:p>
       <w:pPr>
+        <w:spacing w:before="260"/>
         <w:rPr>
           <w:rFonts w:ascii="Times New Roman" w:hAnsi="Times New Roman" w:cs="Times New Roman"/>
           <w:sz w:val="24"/>
@@ -828,7 +829,6 @@
     </w:tbl>
     <w:p>
       <w:pPr>
-        <w:pageBreakBefore/>
         <w:spacing w:after="0" w:line="2" w:lineRule="atLeast"/>
         <w:rPr>
           <w:rFonts w:ascii="Times New Roman" w:hAnsi="Times New Roman" w:cs="Times New Roman"/>
@@ -836,6 +836,12 @@
           <w:szCs w:val="24"/>
           <w:lang w:val="en-US"/>
         </w:rPr>
+        <w:sectPr>
+          <w:pgSz w:w="16330" w:h="11453" w:orient="landscape"/>
+          <w:pgMar w:top="993" w:right="284" w:bottom="284" w:left="1077" w:header="709" w:footer="709" w:gutter="0"/>
+          <w:cols w:space="708"/>
+          <w:docGrid w:linePitch="360"/>
+        </w:sectPr>
       </w:pPr>
     </w:p>
     <w:tbl>
@@ -995,47 +1001,6 @@
       </w:tr>
       <w:tr>
         <w:trPr>
-          <w:trHeight w:val="318"/>
-        </w:trPr>
-        <w:tc>
-          <w:tcPr>
-            <w:tcW w:w="9851" w:type="dxa"/>
-            <w:gridSpan w:val="3"/>
-            <w:shd w:val="clear" w:color="auto" w:fill="auto"/>
-          </w:tcPr>
-          <w:p>
-            <w:pPr>
-              <w:spacing w:after="0" w:line="240" w:lineRule="auto"/>
-              <w:jc w:val="both"/>
-              <w:rPr>
-                <w:rFonts w:ascii="Times New Roman" w:hAnsi="Times New Roman" w:cs="Times New Roman"/>
-                <w:sz w:val="24"/>
-                <w:szCs w:val="24"/>
-              </w:rPr>
-            </w:pPr>
-          </w:p>
-        </w:tc>
-        <w:tc>
-          <w:tcPr>
-            <w:tcW w:w="4927" w:type="dxa"/>
-            <w:shd w:val="clear" w:color="auto" w:fill="auto"/>
-          </w:tcPr>
-          <w:p>
-            <w:pPr>
-              <w:spacing w:after="0" w:line="240" w:lineRule="auto"/>
-              <w:jc w:val="both"/>
-              <w:rPr>
-                <w:rFonts w:ascii="Times New Roman" w:eastAsiaTheme="minorEastAsia" w:hAnsi="Times New Roman" w:cs="Times New Roman"/>
-                <w:sz w:val="24"/>
-                <w:szCs w:val="24"/>
-                <w:lang w:val="en-US" w:eastAsia="ru-RU"/>
-              </w:rPr>
-            </w:pPr>
-          </w:p>
-        </w:tc>
-      </w:tr>
-      <w:tr>
-        <w:trPr>
           <w:trHeight w:val="503"/>
         </w:trPr>
         <w:tc>
@@ -1229,71 +1194,6 @@
         </w:tc>
       </w:tr>
       <w:tr>
-        <w:trPr>
-          <w:trHeight w:val="262"/>
-        </w:trPr>
-        <w:tc>
-          <w:tcPr>
-            <w:tcW w:w="4926" w:type="dxa"/>
-          </w:tcPr>
-          <w:p>
-            <w:pPr>
-              <w:spacing w:after="0" w:line="240" w:lineRule="auto"/>
-              <w:jc w:val="both"/>
-              <w:rPr>
-                <w:rFonts w:ascii="Times New Roman" w:hAnsi="Times New Roman" w:cs="Times New Roman"/>
-                <w:sz w:val="24"/>
-                <w:szCs w:val="24"/>
-                <w:lang w:val="en-US"/>
-              </w:rPr>
-            </w:pPr>
-            <w:r>
-              <w:rPr>
-                <w:rFonts w:ascii="Times New Roman" w:hAnsi="Times New Roman" w:cs="Times New Roman"/>
-                <w:sz w:val="24"/>
-                <w:szCs w:val="24"/>
-              </w:rPr>
-              <w:t xml:space="preserve">                             </w:t>
-            </w:r>
-          </w:p>
-        </w:tc>
-        <w:tc>
-          <w:tcPr>
-            <w:tcW w:w="4567" w:type="dxa"/>
-          </w:tcPr>
-          <w:p>
-            <w:pPr>
-              <w:spacing w:after="0" w:line="240" w:lineRule="auto"/>
-              <w:jc w:val="both"/>
-              <w:rPr>
-                <w:rFonts w:ascii="Times New Roman" w:hAnsi="Times New Roman" w:cs="Times New Roman"/>
-                <w:sz w:val="24"/>
-                <w:szCs w:val="24"/>
-                <w:lang w:val="en-US"/>
-              </w:rPr>
-            </w:pPr>
-          </w:p>
-        </w:tc>
-        <w:tc>
-          <w:tcPr>
-            <w:tcW w:w="5285" w:type="dxa"/>
-            <w:gridSpan w:val="2"/>
-          </w:tcPr>
-          <w:p>
-            <w:pPr>
-              <w:spacing w:after="0" w:line="240" w:lineRule="auto"/>
-              <w:jc w:val="both"/>
-              <w:rPr>
-                <w:rFonts w:ascii="Times New Roman" w:hAnsi="Times New Roman" w:cs="Times New Roman"/>
-                <w:sz w:val="24"/>
-                <w:szCs w:val="24"/>
-                <w:lang w:val="en-US"/>
-              </w:rPr>
-            </w:pPr>
-          </w:p>
-        </w:tc>
-      </w:tr>
-      <w:tr>
         <w:tc>
           <w:tcPr>
             <w:tcW w:w="4926" w:type="dxa"/>
@@ -1327,63 +1227,6 @@
               </w:rPr>
               <w:t>{{shipper_handed_by}}</w:t>
             </w:r>
-          </w:p>
-        </w:tc>
-        <w:tc>
-          <w:tcPr>
-            <w:tcW w:w="4925" w:type="dxa"/>
-            <w:gridSpan w:val="2"/>
-          </w:tcPr>
-          <w:p>
-            <w:pPr>
-              <w:spacing w:after="0" w:line="240" w:lineRule="auto"/>
-              <w:jc w:val="both"/>
-              <w:rPr>
-                <w:rFonts w:ascii="Times New Roman" w:hAnsi="Times New Roman" w:cs="Times New Roman"/>
-                <w:sz w:val="24"/>
-                <w:szCs w:val="24"/>
-                <w:lang w:val="en-US"/>
-              </w:rPr>
-            </w:pPr>
-          </w:p>
-        </w:tc>
-        <w:tc>
-          <w:tcPr>
-            <w:tcW w:w="4927" w:type="dxa"/>
-          </w:tcPr>
-          <w:p>
-            <w:pPr>
-              <w:spacing w:after="0" w:line="240" w:lineRule="auto"/>
-              <w:jc w:val="both"/>
-              <w:rPr>
-                <w:rFonts w:ascii="Times New Roman" w:hAnsi="Times New Roman" w:cs="Times New Roman"/>
-                <w:sz w:val="24"/>
-                <w:szCs w:val="24"/>
-                <w:lang w:val="en-US"/>
-              </w:rPr>
-            </w:pPr>
-          </w:p>
-        </w:tc>
-      </w:tr>
-      <w:tr>
-        <w:trPr>
-          <w:trHeight w:val="90"/>
-        </w:trPr>
-        <w:tc>
-          <w:tcPr>
-            <w:tcW w:w="4926" w:type="dxa"/>
-          </w:tcPr>
-          <w:p>
-            <w:pPr>
-              <w:spacing w:after="0" w:line="240" w:lineRule="auto"/>
-              <w:jc w:val="both"/>
-              <w:rPr>
-                <w:rFonts w:ascii="Times New Roman" w:hAnsi="Times New Roman" w:cs="Times New Roman"/>
-                <w:sz w:val="24"/>
-                <w:szCs w:val="24"/>
-                <w:lang w:val="en-US"/>
-              </w:rPr>
-            </w:pPr>
           </w:p>
         </w:tc>
         <w:tc>
@@ -1463,7 +1306,7 @@
     </w:p>
     <w:sectPr>
       <w:pgSz w:w="16330" w:h="11453" w:orient="landscape"/>
-      <w:pgMar w:top="993" w:right="284" w:bottom="284" w:left="1077" w:header="709" w:footer="709" w:gutter="0"/>
+      <w:pgMar w:top="482" w:right="284" w:bottom="284" w:left="1077" w:header="709" w:footer="709" w:gutter="0"/>
       <w:cols w:space="708"/>
       <w:docGrid w:linePitch="360"/>
     </w:sectPr>

</xml_diff>

<commit_message>
Align TTN cargo columns and lower signature lines
</commit_message>
<xml_diff>
--- a/assets/Шаблон_ТТН_демо.docx
+++ b/assets/Шаблон_ТТН_демо.docx
@@ -653,7 +653,7 @@
     <w:tbl>
       <w:tblPr>
         <w:tblStyle w:val="a5"/>
-        <w:tblW w:w="14968" w:type="dxa"/>
+        <w:tblW w:w="14967" w:type="dxa"/>
         <w:tblInd w:w="0" w:type="dxa"/>
         <w:tblBorders>
           <w:top w:val="none" w:sz="0" w:space="0" w:color="auto"/>
@@ -667,155 +667,188 @@
         <w:tblLook w:val="04A0" w:firstRow="1" w:lastRow="0" w:firstColumn="1" w:lastColumn="0" w:noHBand="0" w:noVBand="1"/>
       </w:tblPr>
       <w:tblGrid>
-        <w:gridCol w:w="4344"/>
-        <w:gridCol w:w="1157"/>
-        <w:gridCol w:w="772"/>
-        <w:gridCol w:w="1157"/>
-        <w:gridCol w:w="1253"/>
-        <w:gridCol w:w="1060"/>
-        <w:gridCol w:w="1061"/>
-        <w:gridCol w:w="1351"/>
-        <w:gridCol w:w="964"/>
-        <w:gridCol w:w="868"/>
-        <w:gridCol w:w="981"/>
+        <w:gridCol w:w="3876"/>
+        <w:gridCol w:w="651"/>
+        <w:gridCol w:w="810"/>
+        <w:gridCol w:w="1359"/>
+        <w:gridCol w:w="1562"/>
+        <w:gridCol w:w="578"/>
+        <w:gridCol w:w="1287"/>
+        <w:gridCol w:w="1345"/>
+        <w:gridCol w:w="1070"/>
+        <w:gridCol w:w="896"/>
+        <w:gridCol w:w="1533"/>
       </w:tblGrid>
       <w:tr>
         <w:tc>
           <w:tcPr>
-            <w:tcW w:w="4344" w:type="dxa"/>
+            <w:tcW w:w="3876" w:type="dxa"/>
           </w:tcPr>
           <w:p>
             <w:pPr>
               <w:jc w:val="left"/>
             </w:pPr>
             <w:r>
+              <w:rPr>
+                <w:sz w:val="20"/>
+              </w:rPr>
               <w:t>{</w:t>
             </w:r>
             <w:r>
+              <w:rPr>
+                <w:sz w:val="20"/>
+              </w:rPr>
               <w:t>{cargo.cargo_name}}</w:t>
             </w:r>
           </w:p>
         </w:tc>
         <w:tc>
           <w:tcPr>
-            <w:tcW w:w="1157" w:type="dxa"/>
+            <w:tcW w:w="651" w:type="dxa"/>
           </w:tcPr>
           <w:p>
             <w:pPr>
               <w:jc w:val="center"/>
             </w:pPr>
             <w:r>
+              <w:rPr>
+                <w:sz w:val="20"/>
+              </w:rPr>
               <w:t>{{cargo.si}}</w:t>
             </w:r>
           </w:p>
         </w:tc>
         <w:tc>
           <w:tcPr>
-            <w:tcW w:w="772" w:type="dxa"/>
+            <w:tcW w:w="810" w:type="dxa"/>
           </w:tcPr>
           <w:p>
             <w:pPr>
               <w:jc w:val="center"/>
             </w:pPr>
             <w:r>
+              <w:rPr>
+                <w:sz w:val="20"/>
+              </w:rPr>
               <w:t>{{cargo.unit}}</w:t>
             </w:r>
           </w:p>
         </w:tc>
         <w:tc>
           <w:tcPr>
-            <w:tcW w:w="1157" w:type="dxa"/>
+            <w:tcW w:w="1359" w:type="dxa"/>
           </w:tcPr>
           <w:p>
             <w:pPr>
               <w:jc w:val="center"/>
             </w:pPr>
             <w:r>
+              <w:rPr>
+                <w:sz w:val="20"/>
+              </w:rPr>
               <w:t>{{cargo.price}}</w:t>
             </w:r>
           </w:p>
         </w:tc>
         <w:tc>
           <w:tcPr>
-            <w:tcW w:w="1253" w:type="dxa"/>
+            <w:tcW w:w="1562" w:type="dxa"/>
           </w:tcPr>
           <w:p>
             <w:pPr>
               <w:jc w:val="center"/>
             </w:pPr>
             <w:r>
+              <w:rPr>
+                <w:sz w:val="20"/>
+              </w:rPr>
               <w:t>{{cargo.total_cost}}</w:t>
             </w:r>
           </w:p>
         </w:tc>
         <w:tc>
           <w:tcPr>
-            <w:tcW w:w="1060" w:type="dxa"/>
+            <w:tcW w:w="578" w:type="dxa"/>
           </w:tcPr>
           <w:p>
             <w:pPr>
               <w:jc w:val="center"/>
             </w:pPr>
             <w:r>
+              <w:rPr>
+                <w:sz w:val="20"/>
+              </w:rPr>
               <w:t>{{cargo.vat_rate}}</w:t>
             </w:r>
           </w:p>
         </w:tc>
         <w:tc>
           <w:tcPr>
-            <w:tcW w:w="1061" w:type="dxa"/>
+            <w:tcW w:w="1287" w:type="dxa"/>
           </w:tcPr>
           <w:p>
             <w:pPr>
               <w:jc w:val="center"/>
             </w:pPr>
             <w:r>
+              <w:rPr>
+                <w:sz w:val="20"/>
+              </w:rPr>
               <w:t>{{cargo.vat_cost}}</w:t>
             </w:r>
           </w:p>
         </w:tc>
         <w:tc>
           <w:tcPr>
-            <w:tcW w:w="1351" w:type="dxa"/>
+            <w:tcW w:w="1345" w:type="dxa"/>
           </w:tcPr>
           <w:p>
             <w:pPr>
               <w:jc w:val="center"/>
             </w:pPr>
             <w:r>
+              <w:rPr>
+                <w:sz w:val="20"/>
+              </w:rPr>
               <w:t>{{cargo.total_with_vat}}</w:t>
             </w:r>
           </w:p>
         </w:tc>
         <w:tc>
           <w:tcPr>
-            <w:tcW w:w="964" w:type="dxa"/>
+            <w:tcW w:w="1070" w:type="dxa"/>
           </w:tcPr>
           <w:p>
             <w:pPr>
               <w:jc w:val="center"/>
             </w:pPr>
             <w:r>
+              <w:rPr>
+                <w:sz w:val="20"/>
+              </w:rPr>
               <w:t>{{cargo.places}}</w:t>
             </w:r>
           </w:p>
         </w:tc>
         <w:tc>
           <w:tcPr>
-            <w:tcW w:w="868" w:type="dxa"/>
+            <w:tcW w:w="896" w:type="dxa"/>
           </w:tcPr>
           <w:p>
             <w:pPr>
               <w:jc w:val="center"/>
             </w:pPr>
             <w:r>
+              <w:rPr>
+                <w:sz w:val="20"/>
+              </w:rPr>
               <w:t>{{cargo.cargo_qty}}</w:t>
             </w:r>
           </w:p>
         </w:tc>
         <w:tc>
           <w:tcPr>
-            <w:tcW w:w="981" w:type="dxa"/>
+            <w:tcW w:w="1533" w:type="dxa"/>
           </w:tcPr>
           <w:p>
             <w:pPr>
@@ -1201,7 +1234,7 @@
           </w:tcPr>
           <w:p>
             <w:pPr>
-              <w:spacing w:after="0" w:line="240" w:lineRule="auto"/>
+              <w:spacing w:after="0" w:line="240" w:lineRule="auto" w:before="520"/>
               <w:jc w:val="both"/>
               <w:rPr>
                 <w:rFonts w:ascii="Times New Roman" w:eastAsiaTheme="minorEastAsia" w:hAnsi="Times New Roman" w:cs="Times New Roman"/>
@@ -1253,7 +1286,7 @@
           </w:tcPr>
           <w:p>
             <w:pPr>
-              <w:spacing w:after="0" w:line="240" w:lineRule="auto"/>
+              <w:spacing w:after="0" w:line="240" w:lineRule="auto" w:before="520"/>
               <w:jc w:val="both"/>
               <w:rPr>
                 <w:rFonts w:ascii="Times New Roman" w:hAnsi="Times New Roman" w:cs="Times New Roman"/>
@@ -1306,7 +1339,7 @@
     </w:p>
     <w:sectPr>
       <w:pgSz w:w="16330" w:h="11453" w:orient="landscape"/>
-      <w:pgMar w:top="482" w:right="284" w:bottom="284" w:left="1077" w:header="709" w:footer="709" w:gutter="0"/>
+      <w:pgMar w:top="510" w:right="284" w:bottom="284" w:left="1077" w:header="709" w:footer="709" w:gutter="0"/>
       <w:cols w:space="708"/>
       <w:docGrid w:linePitch="360"/>
     </w:sectPr>

</xml_diff>

<commit_message>
Separate shipper and consignee signature offsets
</commit_message>
<xml_diff>
--- a/assets/Шаблон_ТТН_демо.docx
+++ b/assets/Шаблон_ТТН_демо.docx
@@ -1234,7 +1234,7 @@
           </w:tcPr>
           <w:p>
             <w:pPr>
-              <w:spacing w:after="0" w:line="240" w:lineRule="auto" w:before="520"/>
+              <w:spacing w:after="0" w:line="240" w:lineRule="auto" w:before="380"/>
               <w:jc w:val="both"/>
               <w:rPr>
                 <w:rFonts w:ascii="Times New Roman" w:eastAsiaTheme="minorEastAsia" w:hAnsi="Times New Roman" w:cs="Times New Roman"/>
@@ -1286,7 +1286,7 @@
           </w:tcPr>
           <w:p>
             <w:pPr>
-              <w:spacing w:after="0" w:line="240" w:lineRule="auto" w:before="520"/>
+              <w:spacing w:after="0" w:line="240" w:lineRule="auto" w:before="740"/>
               <w:jc w:val="both"/>
               <w:rPr>
                 <w:rFonts w:ascii="Times New Roman" w:hAnsi="Times New Roman" w:cs="Times New Roman"/>

</xml_diff>

<commit_message>
Add persistent TTN header requisites
</commit_message>
<xml_diff>
--- a/assets/Шаблон_ТТН_демо.docx
+++ b/assets/Шаблон_ТТН_демо.docx
@@ -4,9 +4,9 @@
   <w:body>
     <w:tbl>
       <w:tblPr>
-        <w:tblStyle w:val="a5"/>
-        <w:tblW w:w="0" w:type="auto"/>
-        <w:tblInd w:w="4219" w:type="dxa"/>
+        <w:tblW w:w="7943" w:type="dxa"/>
+        <w:jc w:val="left"/>
+        <w:tblInd w:w="3400" w:type="dxa"/>
         <w:tblBorders>
           <w:top w:val="none" w:sz="0" w:space="0" w:color="auto"/>
           <w:left w:val="none" w:sz="0" w:space="0" w:color="auto"/>
@@ -15,36 +15,184 @@
           <w:insideH w:val="none" w:sz="0" w:space="0" w:color="auto"/>
           <w:insideV w:val="none" w:sz="0" w:space="0" w:color="auto"/>
         </w:tblBorders>
-        <w:tblLook w:val="04A0" w:firstRow="1" w:lastRow="0" w:firstColumn="1" w:lastColumn="0" w:noHBand="0" w:noVBand="1"/>
+        <w:tblLayout w:type="fixed"/>
+        <w:tblCellMar>
+          <w:top w:w="20" w:type="dxa"/>
+          <w:left w:w="20" w:type="dxa"/>
+          <w:bottom w:w="20" w:type="dxa"/>
+          <w:right w:w="20" w:type="dxa"/>
+        </w:tblCellMar>
       </w:tblPr>
       <w:tblGrid>
+        <w:gridCol w:w="800"/>
         <w:gridCol w:w="2381"/>
         <w:gridCol w:w="2381"/>
         <w:gridCol w:w="2381"/>
       </w:tblGrid>
       <w:tr>
         <w:trPr>
-          <w:trHeight w:hRule="exact" w:val="340"/>
+          <w:trHeight w:val="600" w:hRule="atLeast"/>
         </w:trPr>
         <w:tc>
           <w:tcPr>
-            <w:tcW w:w="2381" w:type="dxa"/>
-          </w:tcPr>
-          <w:p>
-            <w:pPr>
-              <w:spacing w:after="0" w:line="240" w:lineRule="auto"/>
+            <w:tcW w:type="dxa" w:w="800"/>
+            <w:tcBorders>
+              <w:top w:val="nil"/>
+              <w:left w:val="nil"/>
+              <w:bottom w:val="nil"/>
+              <w:right w:val="nil"/>
+              <w:insideH w:val="nil"/>
+              <w:insideV w:val="nil"/>
+            </w:tcBorders>
+          </w:tcPr>
+          <w:p>
+            <w:r/>
+          </w:p>
+        </w:tc>
+        <w:tc>
+          <w:tcPr>
+            <w:tcW w:type="dxa" w:w="2381"/>
+            <w:tcBorders>
+              <w:top w:val="single" w:sz="6" w:space="0" w:color="000000"/>
+              <w:left w:val="single" w:sz="6" w:space="0" w:color="000000"/>
+              <w:bottom w:val="single" w:sz="6" w:space="0" w:color="000000"/>
+              <w:right w:val="single" w:sz="6" w:space="0" w:color="000000"/>
+              <w:insideH w:val="nil"/>
+              <w:insideV w:val="nil"/>
+            </w:tcBorders>
+            <w:vAlign w:val="center"/>
+          </w:tcPr>
+          <w:p>
+            <w:pPr>
+              <w:spacing w:before="0" w:after="0" w:line="240" w:lineRule="auto"/>
               <w:jc w:val="center"/>
-              <w:rPr>
-                <w:rFonts w:ascii="Times New Roman" w:hAnsi="Times New Roman" w:cs="Times New Roman"/>
-                <w:szCs w:val="24"/>
-                <w:lang w:val="en-US"/>
-              </w:rPr>
-            </w:pPr>
-            <w:r>
-              <w:rPr>
-                <w:rFonts w:ascii="Times New Roman" w:hAnsi="Times New Roman" w:cs="Times New Roman"/>
-                <w:szCs w:val="24"/>
-                <w:lang w:val="en-US"/>
+            </w:pPr>
+            <w:r/>
+            <w:r>
+              <w:rPr>
+                <w:rFonts w:ascii="Times New Roman" w:hAnsi="Times New Roman" w:cs="Times New Roman"/>
+                <w:b w:val="0"/>
+                <w:sz w:val="16"/>
+              </w:rPr>
+              <w:t>Грузоотправитель</w:t>
+            </w:r>
+          </w:p>
+        </w:tc>
+        <w:tc>
+          <w:tcPr>
+            <w:tcW w:type="dxa" w:w="2381"/>
+            <w:tcBorders>
+              <w:top w:val="single" w:sz="6" w:space="0" w:color="000000"/>
+              <w:left w:val="single" w:sz="6" w:space="0" w:color="000000"/>
+              <w:bottom w:val="single" w:sz="6" w:space="0" w:color="000000"/>
+              <w:right w:val="single" w:sz="6" w:space="0" w:color="000000"/>
+              <w:insideH w:val="nil"/>
+              <w:insideV w:val="nil"/>
+            </w:tcBorders>
+            <w:vAlign w:val="center"/>
+          </w:tcPr>
+          <w:p>
+            <w:pPr>
+              <w:spacing w:before="0" w:after="0" w:line="240" w:lineRule="auto"/>
+              <w:jc w:val="center"/>
+            </w:pPr>
+            <w:r/>
+            <w:r>
+              <w:rPr>
+                <w:rFonts w:ascii="Times New Roman" w:hAnsi="Times New Roman" w:cs="Times New Roman"/>
+                <w:b w:val="0"/>
+                <w:sz w:val="16"/>
+              </w:rPr>
+              <w:t>Грузополучатель</w:t>
+            </w:r>
+          </w:p>
+        </w:tc>
+        <w:tc>
+          <w:tcPr>
+            <w:tcW w:type="dxa" w:w="2381"/>
+            <w:tcBorders>
+              <w:top w:val="single" w:sz="6" w:space="0" w:color="000000"/>
+              <w:left w:val="single" w:sz="6" w:space="0" w:color="000000"/>
+              <w:bottom w:val="single" w:sz="6" w:space="0" w:color="000000"/>
+              <w:right w:val="single" w:sz="6" w:space="0" w:color="000000"/>
+              <w:insideH w:val="nil"/>
+              <w:insideV w:val="nil"/>
+            </w:tcBorders>
+            <w:vAlign w:val="center"/>
+          </w:tcPr>
+          <w:p>
+            <w:pPr>
+              <w:spacing w:before="0" w:after="0" w:line="240" w:lineRule="auto"/>
+              <w:jc w:val="center"/>
+            </w:pPr>
+            <w:r/>
+            <w:r>
+              <w:rPr>
+                <w:rFonts w:ascii="Times New Roman" w:hAnsi="Times New Roman" w:cs="Times New Roman"/>
+                <w:b w:val="0"/>
+                <w:sz w:val="16"/>
+              </w:rPr>
+              <w:t>Заказчик автомобильной перевозки (плательщик)</w:t>
+            </w:r>
+          </w:p>
+        </w:tc>
+      </w:tr>
+      <w:tr>
+        <w:trPr>
+          <w:trHeight w:val="360" w:hRule="atLeast"/>
+        </w:trPr>
+        <w:tc>
+          <w:tcPr>
+            <w:tcW w:type="dxa" w:w="800"/>
+            <w:tcBorders>
+              <w:top w:val="nil"/>
+              <w:left w:val="nil"/>
+              <w:bottom w:val="nil"/>
+              <w:right w:val="nil"/>
+              <w:insideH w:val="nil"/>
+              <w:insideV w:val="nil"/>
+            </w:tcBorders>
+          </w:tcPr>
+          <w:p>
+            <w:pPr>
+              <w:spacing w:before="0" w:after="0" w:line="240" w:lineRule="auto"/>
+              <w:jc w:val="right"/>
+            </w:pPr>
+            <w:r/>
+            <w:r>
+              <w:rPr>
+                <w:rFonts w:ascii="Times New Roman" w:hAnsi="Times New Roman" w:cs="Times New Roman"/>
+                <w:b w:val="0"/>
+                <w:sz w:val="20"/>
+              </w:rPr>
+              <w:t>УНП</w:t>
+            </w:r>
+          </w:p>
+        </w:tc>
+        <w:tc>
+          <w:tcPr>
+            <w:tcW w:type="dxa" w:w="2381"/>
+            <w:tcBorders>
+              <w:top w:val="single" w:sz="6" w:space="0" w:color="000000"/>
+              <w:left w:val="single" w:sz="6" w:space="0" w:color="000000"/>
+              <w:bottom w:val="single" w:sz="6" w:space="0" w:color="000000"/>
+              <w:right w:val="single" w:sz="6" w:space="0" w:color="000000"/>
+              <w:insideH w:val="nil"/>
+              <w:insideV w:val="nil"/>
+            </w:tcBorders>
+            <w:vAlign w:val="center"/>
+          </w:tcPr>
+          <w:p>
+            <w:pPr>
+              <w:spacing w:before="0" w:after="0" w:line="240" w:lineRule="auto"/>
+              <w:jc w:val="center"/>
+            </w:pPr>
+            <w:r/>
+            <w:r>
+              <w:rPr>
+                <w:rFonts w:ascii="Times New Roman" w:hAnsi="Times New Roman" w:cs="Times New Roman"/>
+                <w:b w:val="0"/>
+                <w:sz w:val="20"/>
               </w:rPr>
               <w:t>{{shipper_unp}}</w:t>
             </w:r>
@@ -52,23 +200,28 @@
         </w:tc>
         <w:tc>
           <w:tcPr>
-            <w:tcW w:w="2381" w:type="dxa"/>
-          </w:tcPr>
-          <w:p>
-            <w:pPr>
-              <w:spacing w:after="0" w:line="240" w:lineRule="auto"/>
+            <w:tcW w:type="dxa" w:w="2381"/>
+            <w:tcBorders>
+              <w:top w:val="single" w:sz="6" w:space="0" w:color="000000"/>
+              <w:left w:val="single" w:sz="6" w:space="0" w:color="000000"/>
+              <w:bottom w:val="single" w:sz="6" w:space="0" w:color="000000"/>
+              <w:right w:val="single" w:sz="6" w:space="0" w:color="000000"/>
+              <w:insideH w:val="nil"/>
+              <w:insideV w:val="nil"/>
+            </w:tcBorders>
+            <w:vAlign w:val="center"/>
+          </w:tcPr>
+          <w:p>
+            <w:pPr>
+              <w:spacing w:before="0" w:after="0" w:line="240" w:lineRule="auto"/>
               <w:jc w:val="center"/>
-              <w:rPr>
-                <w:rFonts w:ascii="Times New Roman" w:hAnsi="Times New Roman" w:cs="Times New Roman"/>
-                <w:szCs w:val="24"/>
-                <w:lang w:val="en-US"/>
-              </w:rPr>
-            </w:pPr>
-            <w:r>
-              <w:rPr>
-                <w:rFonts w:ascii="Times New Roman" w:hAnsi="Times New Roman" w:cs="Times New Roman"/>
-                <w:szCs w:val="24"/>
-                <w:lang w:val="en-US"/>
+            </w:pPr>
+            <w:r/>
+            <w:r>
+              <w:rPr>
+                <w:rFonts w:ascii="Times New Roman" w:hAnsi="Times New Roman" w:cs="Times New Roman"/>
+                <w:b w:val="0"/>
+                <w:sz w:val="20"/>
               </w:rPr>
               <w:t>{{consignee_unp}}</w:t>
             </w:r>
@@ -76,22 +229,28 @@
         </w:tc>
         <w:tc>
           <w:tcPr>
-            <w:tcW w:w="2381" w:type="dxa"/>
-          </w:tcPr>
-          <w:p>
-            <w:pPr>
-              <w:spacing w:after="0" w:line="240" w:lineRule="auto"/>
+            <w:tcW w:type="dxa" w:w="2381"/>
+            <w:tcBorders>
+              <w:top w:val="single" w:sz="6" w:space="0" w:color="000000"/>
+              <w:left w:val="single" w:sz="6" w:space="0" w:color="000000"/>
+              <w:bottom w:val="single" w:sz="6" w:space="0" w:color="000000"/>
+              <w:right w:val="single" w:sz="6" w:space="0" w:color="000000"/>
+              <w:insideH w:val="nil"/>
+              <w:insideV w:val="nil"/>
+            </w:tcBorders>
+            <w:vAlign w:val="center"/>
+          </w:tcPr>
+          <w:p>
+            <w:pPr>
+              <w:spacing w:before="0" w:after="0" w:line="240" w:lineRule="auto"/>
               <w:jc w:val="center"/>
-              <w:rPr>
-                <w:rFonts w:ascii="Times New Roman" w:hAnsi="Times New Roman" w:cs="Times New Roman"/>
-                <w:szCs w:val="24"/>
-              </w:rPr>
-            </w:pPr>
-            <w:r>
-              <w:rPr>
-                <w:rFonts w:ascii="Times New Roman" w:hAnsi="Times New Roman" w:cs="Times New Roman"/>
-                <w:szCs w:val="24"/>
-                <w:lang w:val="en-US"/>
+            </w:pPr>
+            <w:r/>
+            <w:r>
+              <w:rPr>
+                <w:rFonts w:ascii="Times New Roman" w:hAnsi="Times New Roman" w:cs="Times New Roman"/>
+                <w:b w:val="0"/>
+                <w:sz w:val="20"/>
               </w:rPr>
               <w:t>{{customer_unp}}</w:t>
             </w:r>

</xml_diff>

<commit_message>
Remove duplicated TTN top header
</commit_message>
<xml_diff>
--- a/assets/Шаблон_ТТН_демо.docx
+++ b/assets/Шаблон_ТТН_демо.docx
@@ -4,9 +4,9 @@
   <w:body>
     <w:tbl>
       <w:tblPr>
-        <w:tblW w:w="7943" w:type="dxa"/>
-        <w:jc w:val="left"/>
-        <w:tblInd w:w="3400" w:type="dxa"/>
+        <w:tblStyle w:val="a5"/>
+        <w:tblW w:w="0" w:type="auto"/>
+        <w:tblInd w:w="4219" w:type="dxa"/>
         <w:tblBorders>
           <w:top w:val="none" w:sz="0" w:space="0" w:color="auto"/>
           <w:left w:val="none" w:sz="0" w:space="0" w:color="auto"/>
@@ -15,242 +15,83 @@
           <w:insideH w:val="none" w:sz="0" w:space="0" w:color="auto"/>
           <w:insideV w:val="none" w:sz="0" w:space="0" w:color="auto"/>
         </w:tblBorders>
-        <w:tblLayout w:type="fixed"/>
-        <w:tblCellMar>
-          <w:top w:w="20" w:type="dxa"/>
-          <w:left w:w="20" w:type="dxa"/>
-          <w:bottom w:w="20" w:type="dxa"/>
-          <w:right w:w="20" w:type="dxa"/>
-        </w:tblCellMar>
+        <w:tblLook w:val="04A0" w:firstRow="1" w:lastRow="0" w:firstColumn="1" w:lastColumn="0" w:noHBand="0" w:noVBand="1"/>
       </w:tblPr>
       <w:tblGrid>
-        <w:gridCol w:w="800"/>
         <w:gridCol w:w="2381"/>
         <w:gridCol w:w="2381"/>
         <w:gridCol w:w="2381"/>
       </w:tblGrid>
       <w:tr>
         <w:trPr>
-          <w:trHeight w:val="600" w:hRule="atLeast"/>
+          <w:trHeight w:hRule="exact" w:val="340"/>
         </w:trPr>
         <w:tc>
           <w:tcPr>
-            <w:tcW w:type="dxa" w:w="800"/>
-            <w:tcBorders>
-              <w:top w:val="nil"/>
-              <w:left w:val="nil"/>
-              <w:bottom w:val="nil"/>
-              <w:right w:val="nil"/>
-              <w:insideH w:val="nil"/>
-              <w:insideV w:val="nil"/>
-            </w:tcBorders>
-          </w:tcPr>
-          <w:p>
-            <w:r/>
-          </w:p>
-        </w:tc>
-        <w:tc>
-          <w:tcPr>
-            <w:tcW w:type="dxa" w:w="2381"/>
-            <w:tcBorders>
-              <w:top w:val="single" w:sz="6" w:space="0" w:color="000000"/>
-              <w:left w:val="single" w:sz="6" w:space="0" w:color="000000"/>
-              <w:bottom w:val="single" w:sz="6" w:space="0" w:color="000000"/>
-              <w:right w:val="single" w:sz="6" w:space="0" w:color="000000"/>
-              <w:insideH w:val="nil"/>
-              <w:insideV w:val="nil"/>
-            </w:tcBorders>
-            <w:vAlign w:val="center"/>
-          </w:tcPr>
-          <w:p>
-            <w:pPr>
-              <w:spacing w:before="0" w:after="0" w:line="240" w:lineRule="auto"/>
+            <w:tcW w:w="2381" w:type="dxa"/>
+          </w:tcPr>
+          <w:p>
+            <w:pPr>
+              <w:spacing w:after="0" w:line="240" w:lineRule="auto"/>
               <w:jc w:val="center"/>
-            </w:pPr>
-            <w:r/>
-            <w:r>
-              <w:rPr>
-                <w:rFonts w:ascii="Times New Roman" w:hAnsi="Times New Roman" w:cs="Times New Roman"/>
-                <w:b w:val="0"/>
-                <w:sz w:val="16"/>
-              </w:rPr>
-              <w:t>Грузоотправитель</w:t>
-            </w:r>
-          </w:p>
-        </w:tc>
-        <w:tc>
-          <w:tcPr>
-            <w:tcW w:type="dxa" w:w="2381"/>
-            <w:tcBorders>
-              <w:top w:val="single" w:sz="6" w:space="0" w:color="000000"/>
-              <w:left w:val="single" w:sz="6" w:space="0" w:color="000000"/>
-              <w:bottom w:val="single" w:sz="6" w:space="0" w:color="000000"/>
-              <w:right w:val="single" w:sz="6" w:space="0" w:color="000000"/>
-              <w:insideH w:val="nil"/>
-              <w:insideV w:val="nil"/>
-            </w:tcBorders>
-            <w:vAlign w:val="center"/>
-          </w:tcPr>
-          <w:p>
-            <w:pPr>
-              <w:spacing w:before="0" w:after="0" w:line="240" w:lineRule="auto"/>
+              <w:rPr>
+                <w:rFonts w:ascii="Times New Roman" w:hAnsi="Times New Roman" w:cs="Times New Roman"/>
+                <w:szCs w:val="24"/>
+                <w:lang w:val="en-US"/>
+              </w:rPr>
+            </w:pPr>
+            <w:r>
+              <w:rPr>
+                <w:rFonts w:ascii="Times New Roman" w:hAnsi="Times New Roman" w:cs="Times New Roman"/>
+                <w:szCs w:val="24"/>
+                <w:lang w:val="en-US"/>
+              </w:rPr>
+              <w:t>{{shipper_unp}}</w:t>
+            </w:r>
+          </w:p>
+        </w:tc>
+        <w:tc>
+          <w:tcPr>
+            <w:tcW w:w="2381" w:type="dxa"/>
+          </w:tcPr>
+          <w:p>
+            <w:pPr>
+              <w:spacing w:after="0" w:line="240" w:lineRule="auto"/>
               <w:jc w:val="center"/>
-            </w:pPr>
-            <w:r/>
-            <w:r>
-              <w:rPr>
-                <w:rFonts w:ascii="Times New Roman" w:hAnsi="Times New Roman" w:cs="Times New Roman"/>
-                <w:b w:val="0"/>
-                <w:sz w:val="16"/>
-              </w:rPr>
-              <w:t>Грузополучатель</w:t>
-            </w:r>
-          </w:p>
-        </w:tc>
-        <w:tc>
-          <w:tcPr>
-            <w:tcW w:type="dxa" w:w="2381"/>
-            <w:tcBorders>
-              <w:top w:val="single" w:sz="6" w:space="0" w:color="000000"/>
-              <w:left w:val="single" w:sz="6" w:space="0" w:color="000000"/>
-              <w:bottom w:val="single" w:sz="6" w:space="0" w:color="000000"/>
-              <w:right w:val="single" w:sz="6" w:space="0" w:color="000000"/>
-              <w:insideH w:val="nil"/>
-              <w:insideV w:val="nil"/>
-            </w:tcBorders>
-            <w:vAlign w:val="center"/>
-          </w:tcPr>
-          <w:p>
-            <w:pPr>
-              <w:spacing w:before="0" w:after="0" w:line="240" w:lineRule="auto"/>
+              <w:rPr>
+                <w:rFonts w:ascii="Times New Roman" w:hAnsi="Times New Roman" w:cs="Times New Roman"/>
+                <w:szCs w:val="24"/>
+                <w:lang w:val="en-US"/>
+              </w:rPr>
+            </w:pPr>
+            <w:r>
+              <w:rPr>
+                <w:rFonts w:ascii="Times New Roman" w:hAnsi="Times New Roman" w:cs="Times New Roman"/>
+                <w:szCs w:val="24"/>
+                <w:lang w:val="en-US"/>
+              </w:rPr>
+              <w:t>{{consignee_unp}}</w:t>
+            </w:r>
+          </w:p>
+        </w:tc>
+        <w:tc>
+          <w:tcPr>
+            <w:tcW w:w="2381" w:type="dxa"/>
+          </w:tcPr>
+          <w:p>
+            <w:pPr>
+              <w:spacing w:after="0" w:line="240" w:lineRule="auto"/>
               <w:jc w:val="center"/>
-            </w:pPr>
-            <w:r/>
-            <w:r>
-              <w:rPr>
-                <w:rFonts w:ascii="Times New Roman" w:hAnsi="Times New Roman" w:cs="Times New Roman"/>
-                <w:b w:val="0"/>
-                <w:sz w:val="16"/>
-              </w:rPr>
-              <w:t>Заказчик автомобильной перевозки (плательщик)</w:t>
-            </w:r>
-          </w:p>
-        </w:tc>
-      </w:tr>
-      <w:tr>
-        <w:trPr>
-          <w:trHeight w:val="360" w:hRule="atLeast"/>
-        </w:trPr>
-        <w:tc>
-          <w:tcPr>
-            <w:tcW w:type="dxa" w:w="800"/>
-            <w:tcBorders>
-              <w:top w:val="nil"/>
-              <w:left w:val="nil"/>
-              <w:bottom w:val="nil"/>
-              <w:right w:val="nil"/>
-              <w:insideH w:val="nil"/>
-              <w:insideV w:val="nil"/>
-            </w:tcBorders>
-          </w:tcPr>
-          <w:p>
-            <w:pPr>
-              <w:spacing w:before="0" w:after="0" w:line="240" w:lineRule="auto"/>
-              <w:jc w:val="right"/>
-            </w:pPr>
-            <w:r/>
-            <w:r>
-              <w:rPr>
-                <w:rFonts w:ascii="Times New Roman" w:hAnsi="Times New Roman" w:cs="Times New Roman"/>
-                <w:b w:val="0"/>
-                <w:sz w:val="20"/>
-              </w:rPr>
-              <w:t>УНП</w:t>
-            </w:r>
-          </w:p>
-        </w:tc>
-        <w:tc>
-          <w:tcPr>
-            <w:tcW w:type="dxa" w:w="2381"/>
-            <w:tcBorders>
-              <w:top w:val="single" w:sz="6" w:space="0" w:color="000000"/>
-              <w:left w:val="single" w:sz="6" w:space="0" w:color="000000"/>
-              <w:bottom w:val="single" w:sz="6" w:space="0" w:color="000000"/>
-              <w:right w:val="single" w:sz="6" w:space="0" w:color="000000"/>
-              <w:insideH w:val="nil"/>
-              <w:insideV w:val="nil"/>
-            </w:tcBorders>
-            <w:vAlign w:val="center"/>
-          </w:tcPr>
-          <w:p>
-            <w:pPr>
-              <w:spacing w:before="0" w:after="0" w:line="240" w:lineRule="auto"/>
-              <w:jc w:val="center"/>
-            </w:pPr>
-            <w:r/>
-            <w:r>
-              <w:rPr>
-                <w:rFonts w:ascii="Times New Roman" w:hAnsi="Times New Roman" w:cs="Times New Roman"/>
-                <w:b w:val="0"/>
-                <w:sz w:val="20"/>
-              </w:rPr>
-              <w:t>{{shipper_unp}}</w:t>
-            </w:r>
-          </w:p>
-        </w:tc>
-        <w:tc>
-          <w:tcPr>
-            <w:tcW w:type="dxa" w:w="2381"/>
-            <w:tcBorders>
-              <w:top w:val="single" w:sz="6" w:space="0" w:color="000000"/>
-              <w:left w:val="single" w:sz="6" w:space="0" w:color="000000"/>
-              <w:bottom w:val="single" w:sz="6" w:space="0" w:color="000000"/>
-              <w:right w:val="single" w:sz="6" w:space="0" w:color="000000"/>
-              <w:insideH w:val="nil"/>
-              <w:insideV w:val="nil"/>
-            </w:tcBorders>
-            <w:vAlign w:val="center"/>
-          </w:tcPr>
-          <w:p>
-            <w:pPr>
-              <w:spacing w:before="0" w:after="0" w:line="240" w:lineRule="auto"/>
-              <w:jc w:val="center"/>
-            </w:pPr>
-            <w:r/>
-            <w:r>
-              <w:rPr>
-                <w:rFonts w:ascii="Times New Roman" w:hAnsi="Times New Roman" w:cs="Times New Roman"/>
-                <w:b w:val="0"/>
-                <w:sz w:val="20"/>
-              </w:rPr>
-              <w:t>{{consignee_unp}}</w:t>
-            </w:r>
-          </w:p>
-        </w:tc>
-        <w:tc>
-          <w:tcPr>
-            <w:tcW w:type="dxa" w:w="2381"/>
-            <w:tcBorders>
-              <w:top w:val="single" w:sz="6" w:space="0" w:color="000000"/>
-              <w:left w:val="single" w:sz="6" w:space="0" w:color="000000"/>
-              <w:bottom w:val="single" w:sz="6" w:space="0" w:color="000000"/>
-              <w:right w:val="single" w:sz="6" w:space="0" w:color="000000"/>
-              <w:insideH w:val="nil"/>
-              <w:insideV w:val="nil"/>
-            </w:tcBorders>
-            <w:vAlign w:val="center"/>
-          </w:tcPr>
-          <w:p>
-            <w:pPr>
-              <w:spacing w:before="0" w:after="0" w:line="240" w:lineRule="auto"/>
-              <w:jc w:val="center"/>
-            </w:pPr>
-            <w:r/>
-            <w:r>
-              <w:rPr>
-                <w:rFonts w:ascii="Times New Roman" w:hAnsi="Times New Roman" w:cs="Times New Roman"/>
-                <w:b w:val="0"/>
-                <w:sz w:val="20"/>
+              <w:rPr>
+                <w:rFonts w:ascii="Times New Roman" w:hAnsi="Times New Roman" w:cs="Times New Roman"/>
+                <w:szCs w:val="24"/>
+              </w:rPr>
+            </w:pPr>
+            <w:r>
+              <w:rPr>
+                <w:rFonts w:ascii="Times New Roman" w:hAnsi="Times New Roman" w:cs="Times New Roman"/>
+                <w:szCs w:val="24"/>
+                <w:lang w:val="en-US"/>
               </w:rPr>
               <w:t>{{customer_unp}}</w:t>
             </w:r>

</xml_diff>